<commit_message>
Añadidos temas 09-12 y actualizados titulos en index.html
</commit_message>
<xml_diff>
--- a/TRABAJO DE ENFOQUE/TRABAJO_FINAL_MURGI_SL_V3.docx
+++ b/TRABAJO DE ENFOQUE/TRABAJO_FINAL_MURGI_SL_V3.docx
@@ -34,7 +34,7 @@
                     <pic:cNvPicPr preferRelativeResize="0"/>
                   </pic:nvPicPr>
                   <pic:blipFill>
-                    <a:blip r:embed="rId6"/>
+                    <a:blip r:embed="rId7"/>
                     <a:srcRect/>
                     <a:stretch>
                       <a:fillRect/>
@@ -82,7 +82,7 @@
                     <pic:cNvPicPr preferRelativeResize="0"/>
                   </pic:nvPicPr>
                   <pic:blipFill>
-                    <a:blip r:embed="rId6"/>
+                    <a:blip r:embed="rId7"/>
                     <a:srcRect/>
                     <a:stretch>
                       <a:fillRect/>
@@ -324,11 +324,95 @@
           <w:rFonts w:ascii="Manrope" w:eastAsia="Manrope" w:hAnsi="Manrope" w:cs="Manrope"/>
           <w:b/>
           <w:color w:val="003594"/>
-          <w:sz w:val="36"/>
-          <w:szCs w:val="36"/>
-        </w:rPr>
-      </w:pPr>
-      <w:r>
+          <w:sz w:val="40"/>
+          <w:szCs w:val="40"/>
+        </w:rPr>
+      </w:pPr>
+      <w:r>
+        <w:br/>
+      </w:r>
+      <w:r>
+        <w:br/>
+      </w:r>
+      <w:r>
+        <w:br/>
+      </w:r>
+      <w:r>
+        <w:br/>
+      </w:r>
+      <w:r>
+        <w:br/>
+      </w:r>
+      <w:r>
+        <w:br/>
+      </w:r>
+      <w:r>
+        <w:br/>
+      </w:r>
+      <w:r>
+        <w:br/>
+      </w:r>
+      <w:r>
+        <w:br/>
+      </w:r>
+      <w:r>
+        <w:br/>
+      </w:r>
+      <w:r>
+        <w:br/>
+      </w:r>
+      <w:r>
+        <w:br/>
+      </w:r>
+      <w:r>
+        <w:br/>
+      </w:r>
+      <w:r>
+        <w:br/>
+      </w:r>
+      <w:r>
+        <w:br/>
+      </w:r>
+      <w:r>
+        <w:br/>
+      </w:r>
+      <w:r>
+        <w:rPr>
+          <w:sz w:val="40"/>
+          <w:szCs w:val="40"/>
+        </w:rPr>
+        <w:t xml:space="preserve">Francisco </w:t>
+      </w:r>
+      <w:proofErr w:type="spellStart"/>
+      <w:r>
+        <w:rPr>
+          <w:sz w:val="40"/>
+          <w:szCs w:val="40"/>
+        </w:rPr>
+        <w:t>Mifsut</w:t>
+      </w:r>
+      <w:proofErr w:type="spellEnd"/>
+      <w:r>
+        <w:rPr>
+          <w:sz w:val="40"/>
+          <w:szCs w:val="40"/>
+        </w:rPr>
+        <w:t xml:space="preserve"> </w:t>
+      </w:r>
+      <w:proofErr w:type="spellStart"/>
+      <w:r>
+        <w:rPr>
+          <w:sz w:val="40"/>
+          <w:szCs w:val="40"/>
+        </w:rPr>
+        <w:t>Barcenilla</w:t>
+      </w:r>
+      <w:proofErr w:type="spellEnd"/>
+      <w:r>
+        <w:rPr>
+          <w:sz w:val="40"/>
+          <w:szCs w:val="40"/>
+        </w:rPr>
         <w:br w:type="page"/>
       </w:r>
     </w:p>
@@ -371,7 +455,21 @@
           <w:rFonts w:ascii="Manrope" w:hAnsi="Manrope"/>
           <w:sz w:val="22"/>
         </w:rPr>
-        <w:t>2. Desarrollo de la Idea: El toque innovador</w:t>
+        <w:t xml:space="preserve">2. Desarrollo de la </w:t>
+      </w:r>
+      <w:r>
+        <w:rPr>
+          <w:rFonts w:ascii="Manrope" w:hAnsi="Manrope"/>
+          <w:sz w:val="22"/>
+        </w:rPr>
+        <w:t>i</w:t>
+      </w:r>
+      <w:r>
+        <w:rPr>
+          <w:rFonts w:ascii="Manrope" w:hAnsi="Manrope"/>
+          <w:sz w:val="22"/>
+        </w:rPr>
+        <w:t>dea: El toque innovador</w:t>
       </w:r>
       <w:r>
         <w:t xml:space="preserve"> ........................................................................</w:t>
@@ -386,7 +484,35 @@
           <w:rFonts w:ascii="Manrope" w:hAnsi="Manrope"/>
           <w:sz w:val="22"/>
         </w:rPr>
-        <w:t>3. Estructura Organizativa y Recursos</w:t>
+        <w:t xml:space="preserve">3. Estructura </w:t>
+      </w:r>
+      <w:r>
+        <w:rPr>
+          <w:rFonts w:ascii="Manrope" w:hAnsi="Manrope"/>
+          <w:sz w:val="22"/>
+        </w:rPr>
+        <w:t>o</w:t>
+      </w:r>
+      <w:r>
+        <w:rPr>
+          <w:rFonts w:ascii="Manrope" w:hAnsi="Manrope"/>
+          <w:sz w:val="22"/>
+        </w:rPr>
+        <w:t xml:space="preserve">rganizativa y </w:t>
+      </w:r>
+      <w:r>
+        <w:rPr>
+          <w:rFonts w:ascii="Manrope" w:hAnsi="Manrope"/>
+          <w:sz w:val="22"/>
+        </w:rPr>
+        <w:t>r</w:t>
+      </w:r>
+      <w:r>
+        <w:rPr>
+          <w:rFonts w:ascii="Manrope" w:hAnsi="Manrope"/>
+          <w:sz w:val="22"/>
+        </w:rPr>
+        <w:t>ecursos</w:t>
       </w:r>
       <w:r>
         <w:t xml:space="preserve"> ........................................................................</w:t>
@@ -401,7 +527,49 @@
           <w:rFonts w:ascii="Manrope" w:hAnsi="Manrope"/>
           <w:sz w:val="22"/>
         </w:rPr>
-        <w:t xml:space="preserve">  El Organigrama (Nuestra Hoja de Ruta Interna)</w:t>
+        <w:t xml:space="preserve">  El Organigrama (Nuestra </w:t>
+      </w:r>
+      <w:r>
+        <w:rPr>
+          <w:rFonts w:ascii="Manrope" w:hAnsi="Manrope"/>
+          <w:sz w:val="22"/>
+        </w:rPr>
+        <w:t>h</w:t>
+      </w:r>
+      <w:r>
+        <w:rPr>
+          <w:rFonts w:ascii="Manrope" w:hAnsi="Manrope"/>
+          <w:sz w:val="22"/>
+        </w:rPr>
+        <w:t xml:space="preserve">oja de </w:t>
+      </w:r>
+      <w:r>
+        <w:rPr>
+          <w:rFonts w:ascii="Manrope" w:hAnsi="Manrope"/>
+          <w:sz w:val="22"/>
+        </w:rPr>
+        <w:t>r</w:t>
+      </w:r>
+      <w:r>
+        <w:rPr>
+          <w:rFonts w:ascii="Manrope" w:hAnsi="Manrope"/>
+          <w:sz w:val="22"/>
+        </w:rPr>
+        <w:t xml:space="preserve">uta </w:t>
+      </w:r>
+      <w:r>
+        <w:rPr>
+          <w:rFonts w:ascii="Manrope" w:hAnsi="Manrope"/>
+          <w:sz w:val="22"/>
+        </w:rPr>
+        <w:t>i</w:t>
+      </w:r>
+      <w:r>
+        <w:rPr>
+          <w:rFonts w:ascii="Manrope" w:hAnsi="Manrope"/>
+          <w:sz w:val="22"/>
+        </w:rPr>
+        <w:t>nterna)</w:t>
       </w:r>
       <w:r>
         <w:t xml:space="preserve"> ........................................................................</w:t>
@@ -416,7 +584,78 @@
           <w:rFonts w:ascii="Manrope" w:hAnsi="Manrope"/>
           <w:sz w:val="22"/>
         </w:rPr>
-        <w:t xml:space="preserve">  Necesidades de Recursos Humanos y Materiales</w:t>
+        <w:t xml:space="preserve">  Necesidades de </w:t>
+      </w:r>
+      <w:r>
+        <w:rPr>
+          <w:rFonts w:ascii="Manrope" w:hAnsi="Manrope"/>
+          <w:sz w:val="22"/>
+        </w:rPr>
+        <w:t>r</w:t>
+      </w:r>
+      <w:r>
+        <w:rPr>
+          <w:rFonts w:ascii="Manrope" w:hAnsi="Manrope"/>
+          <w:sz w:val="22"/>
+        </w:rPr>
+        <w:t xml:space="preserve">ecursos </w:t>
+      </w:r>
+      <w:r>
+        <w:rPr>
+          <w:rFonts w:ascii="Manrope" w:hAnsi="Manrope"/>
+          <w:sz w:val="22"/>
+        </w:rPr>
+        <w:t>h</w:t>
+      </w:r>
+      <w:r>
+        <w:rPr>
+          <w:rFonts w:ascii="Manrope" w:hAnsi="Manrope"/>
+          <w:sz w:val="22"/>
+        </w:rPr>
+        <w:t xml:space="preserve">umanos y </w:t>
+      </w:r>
+      <w:r>
+        <w:rPr>
+          <w:rFonts w:ascii="Manrope" w:hAnsi="Manrope"/>
+          <w:sz w:val="22"/>
+        </w:rPr>
+        <w:t>m</w:t>
+      </w:r>
+      <w:r>
+        <w:rPr>
+          <w:rFonts w:ascii="Manrope" w:hAnsi="Manrope"/>
+          <w:sz w:val="22"/>
+        </w:rPr>
+        <w:t>ateriales</w:t>
+      </w:r>
+      <w:r>
+        <w:t xml:space="preserve"> ..................................................................</w:t>
+      </w:r>
+    </w:p>
+    <w:p>
+      <w:pPr>
+        <w:jc w:val="left"/>
+      </w:pPr>
+      <w:r>
+        <w:rPr>
+          <w:rFonts w:ascii="Manrope" w:hAnsi="Manrope"/>
+          <w:sz w:val="22"/>
+        </w:rPr>
+        <w:t xml:space="preserve">4. Estudio de </w:t>
+      </w:r>
+      <w:r>
+        <w:rPr>
+          <w:rFonts w:ascii="Manrope" w:hAnsi="Manrope"/>
+          <w:sz w:val="22"/>
+        </w:rPr>
+        <w:t>m</w:t>
+      </w:r>
+      <w:r>
+        <w:rPr>
+          <w:rFonts w:ascii="Manrope" w:hAnsi="Manrope"/>
+          <w:sz w:val="22"/>
+        </w:rPr>
+        <w:t>ercado</w:t>
       </w:r>
       <w:r>
         <w:t xml:space="preserve"> ........................................................................</w:t>
@@ -431,7 +670,21 @@
           <w:rFonts w:ascii="Manrope" w:hAnsi="Manrope"/>
           <w:sz w:val="22"/>
         </w:rPr>
-        <w:t>4. Estudio de Mercado</w:t>
+        <w:t xml:space="preserve">  Público </w:t>
+      </w:r>
+      <w:r>
+        <w:rPr>
+          <w:rFonts w:ascii="Manrope" w:hAnsi="Manrope"/>
+          <w:sz w:val="22"/>
+        </w:rPr>
+        <w:t>o</w:t>
+      </w:r>
+      <w:r>
+        <w:rPr>
+          <w:rFonts w:ascii="Manrope" w:hAnsi="Manrope"/>
+          <w:sz w:val="22"/>
+        </w:rPr>
+        <w:t>bjetivo: ¿Quién nos necesita?</w:t>
       </w:r>
       <w:r>
         <w:t xml:space="preserve"> ........................................................................</w:t>
@@ -446,7 +699,21 @@
           <w:rFonts w:ascii="Manrope" w:hAnsi="Manrope"/>
           <w:sz w:val="22"/>
         </w:rPr>
-        <w:t xml:space="preserve">  Público Objetivo: ¿Quién nos necesita?</w:t>
+        <w:t xml:space="preserve">  Análisis de la </w:t>
+      </w:r>
+      <w:r>
+        <w:rPr>
+          <w:rFonts w:ascii="Manrope" w:hAnsi="Manrope"/>
+          <w:sz w:val="22"/>
+        </w:rPr>
+        <w:t>c</w:t>
+      </w:r>
+      <w:r>
+        <w:rPr>
+          <w:rFonts w:ascii="Manrope" w:hAnsi="Manrope"/>
+          <w:sz w:val="22"/>
+        </w:rPr>
+        <w:t>ompetencia</w:t>
       </w:r>
       <w:r>
         <w:t xml:space="preserve"> ........................................................................</w:t>
@@ -461,7 +728,7 @@
           <w:rFonts w:ascii="Manrope" w:hAnsi="Manrope"/>
           <w:sz w:val="22"/>
         </w:rPr>
-        <w:t xml:space="preserve">  Análisis de la Competencia</w:t>
+        <w:t xml:space="preserve">  Análisis PEST (El entorno)</w:t>
       </w:r>
       <w:r>
         <w:t xml:space="preserve"> ........................................................................</w:t>
@@ -476,7 +743,7 @@
           <w:rFonts w:ascii="Manrope" w:hAnsi="Manrope"/>
           <w:sz w:val="22"/>
         </w:rPr>
-        <w:t xml:space="preserve">  Análisis PEST (El entorno)</w:t>
+        <w:t xml:space="preserve">  Matriz DAFO (Realidad sin filtros)</w:t>
       </w:r>
       <w:r>
         <w:t xml:space="preserve"> ........................................................................</w:t>
@@ -491,7 +758,21 @@
           <w:rFonts w:ascii="Manrope" w:hAnsi="Manrope"/>
           <w:sz w:val="22"/>
         </w:rPr>
-        <w:t xml:space="preserve">  Matriz DAFO (Realidad sin filtros)</w:t>
+        <w:t xml:space="preserve">5. Forma </w:t>
+      </w:r>
+      <w:r>
+        <w:rPr>
+          <w:rFonts w:ascii="Manrope" w:hAnsi="Manrope"/>
+          <w:sz w:val="22"/>
+        </w:rPr>
+        <w:t>j</w:t>
+      </w:r>
+      <w:r>
+        <w:rPr>
+          <w:rFonts w:ascii="Manrope" w:hAnsi="Manrope"/>
+          <w:sz w:val="22"/>
+        </w:rPr>
+        <w:t>urídica: ¿Cómo nos constituimos?</w:t>
       </w:r>
       <w:r>
         <w:t xml:space="preserve"> ........................................................................</w:t>
@@ -506,7 +787,7 @@
           <w:rFonts w:ascii="Manrope" w:hAnsi="Manrope"/>
           <w:sz w:val="22"/>
         </w:rPr>
-        <w:t>5. Forma Jurídica: ¿Cómo nos constituimos?</w:t>
+        <w:t>6. Conclusión</w:t>
       </w:r>
       <w:r>
         <w:t xml:space="preserve"> ........................................................................</w:t>
@@ -521,22 +802,21 @@
           <w:rFonts w:ascii="Manrope" w:hAnsi="Manrope"/>
           <w:sz w:val="22"/>
         </w:rPr>
-        <w:t>6. Conclusión</w:t>
-      </w:r>
-      <w:r>
-        <w:t xml:space="preserve"> ........................................................................</w:t>
-      </w:r>
-    </w:p>
-    <w:p>
-      <w:pPr>
-        <w:jc w:val="left"/>
-      </w:pPr>
-      <w:r>
-        <w:rPr>
-          <w:rFonts w:ascii="Manrope" w:hAnsi="Manrope"/>
-          <w:sz w:val="22"/>
-        </w:rPr>
-        <w:t>7. Bibliografía y Recursos</w:t>
+        <w:t xml:space="preserve">7. Bibliografía y </w:t>
+      </w:r>
+      <w:r>
+        <w:rPr>
+          <w:rFonts w:ascii="Manrope" w:hAnsi="Manrope"/>
+          <w:sz w:val="22"/>
+        </w:rPr>
+        <w:t>r</w:t>
+      </w:r>
+      <w:r>
+        <w:rPr>
+          <w:rFonts w:ascii="Manrope" w:hAnsi="Manrope"/>
+          <w:sz w:val="22"/>
+        </w:rPr>
+        <w:t>ecursos</w:t>
       </w:r>
       <w:r>
         <w:t xml:space="preserve"> ........................................................................</w:t>
@@ -566,7 +846,6 @@
       <w:r>
         <w:rPr>
           <w:rFonts w:ascii="Manrope" w:hAnsi="Manrope"/>
-          <w:sz w:val="22"/>
         </w:rPr>
         <w:t xml:space="preserve">La verdad es que, si te detienes a pensarlo un momento, es un poco loco cómo nos hemos desconectado de lo que comemos en las ciudades. Sin embargo, viniendo de la tierra que venimos, de ese </w:t>
       </w:r>
@@ -574,50 +853,52 @@
         <w:rPr>
           <w:rFonts w:ascii="Manrope" w:hAnsi="Manrope"/>
           <w:b/>
-          <w:sz w:val="22"/>
         </w:rPr>
         <w:t>"Mar de Plástico" de El Ejido</w:t>
       </w:r>
       <w:r>
         <w:rPr>
           <w:rFonts w:ascii="Manrope" w:hAnsi="Manrope"/>
-          <w:sz w:val="22"/>
         </w:rPr>
         <w:t xml:space="preserve"> que alimenta a media Europa, sabemos mejor que nadie el valor de un buen cultivo. </w:t>
       </w:r>
       <w:r>
         <w:rPr>
           <w:rFonts w:ascii="Manrope" w:hAnsi="Manrope"/>
-          <w:sz w:val="22"/>
         </w:rPr>
         <w:br/>
       </w:r>
       <w:r>
         <w:rPr>
           <w:rFonts w:ascii="Manrope" w:hAnsi="Manrope"/>
-          <w:sz w:val="22"/>
         </w:rPr>
         <w:br/>
       </w:r>
       <w:r>
         <w:rPr>
           <w:rFonts w:ascii="Manrope" w:hAnsi="Manrope"/>
-          <w:sz w:val="22"/>
         </w:rPr>
         <w:t xml:space="preserve">Nuestra misión con </w:t>
       </w:r>
-      <w:r>
-        <w:rPr>
-          <w:rFonts w:ascii="Manrope" w:hAnsi="Manrope"/>
-          <w:b/>
-          <w:sz w:val="22"/>
-        </w:rPr>
-        <w:t>Murgi SL</w:t>
-      </w:r>
-      <w:r>
-        <w:rPr>
-          <w:rFonts w:ascii="Manrope" w:hAnsi="Manrope"/>
-          <w:sz w:val="22"/>
+      <w:proofErr w:type="spellStart"/>
+      <w:r>
+        <w:rPr>
+          <w:rFonts w:ascii="Manrope" w:hAnsi="Manrope"/>
+          <w:b/>
+        </w:rPr>
+        <w:t>Murgi</w:t>
+      </w:r>
+      <w:proofErr w:type="spellEnd"/>
+      <w:r>
+        <w:rPr>
+          <w:rFonts w:ascii="Manrope" w:hAnsi="Manrope"/>
+          <w:b/>
+        </w:rPr>
+        <w:t xml:space="preserve"> SL</w:t>
+      </w:r>
+      <w:r>
+        <w:rPr>
+          <w:rFonts w:ascii="Manrope" w:hAnsi="Manrope"/>
         </w:rPr>
         <w:t xml:space="preserve"> es coger toda esa sabiduría agrícola de nuestra tierra y concentrarla en un sistema que quepa en un cuarto piso sin balcón en mitad de una gran ciudad. Queremos que la fuerza del Poniente Almeriense llegue a cualquier salón.</w:t>
       </w:r>
@@ -660,28 +941,37 @@
     <w:p>
       <w:pPr>
         <w:jc w:val="left"/>
-      </w:pPr>
-      <w:r>
-        <w:rPr>
-          <w:rFonts w:ascii="Manrope" w:hAnsi="Manrope"/>
-          <w:sz w:val="22"/>
-        </w:rPr>
-        <w:t xml:space="preserve">¿Qué nos hace diferentes? Pues bien, la clave está en que no te vendemos solo una maceta bonita. Hemos diseñado un sistema de </w:t>
-      </w:r>
-      <w:r>
-        <w:rPr>
-          <w:rFonts w:ascii="Manrope" w:hAnsi="Manrope"/>
-          <w:b/>
-          <w:sz w:val="22"/>
-        </w:rPr>
-        <w:t>huertos verticales inteligentes</w:t>
-      </w:r>
-      <w:r>
-        <w:rPr>
-          <w:rFonts w:ascii="Manrope" w:hAnsi="Manrope"/>
-          <w:sz w:val="22"/>
-        </w:rPr>
-        <w:t xml:space="preserve"> que utilizan hidroponía avanzada (cultivo en agua, sin tierra) y están conectados a una app que lo hace todo por ti.</w:t>
+        <w:rPr>
+          <w:rFonts w:ascii="Manrope" w:hAnsi="Manrope"/>
+          <w:lang w:val="es-ES"/>
+        </w:rPr>
+      </w:pPr>
+      <w:proofErr w:type="spellStart"/>
+      <w:r>
+        <w:rPr>
+          <w:rFonts w:ascii="Manrope" w:hAnsi="Manrope"/>
+          <w:b/>
+          <w:bCs/>
+          <w:lang w:val="es-ES"/>
+        </w:rPr>
+        <w:t>Murgi</w:t>
+      </w:r>
+      <w:proofErr w:type="spellEnd"/>
+      <w:r>
+        <w:rPr>
+          <w:rFonts w:ascii="Manrope" w:hAnsi="Manrope"/>
+          <w:b/>
+          <w:bCs/>
+          <w:lang w:val="es-ES"/>
+        </w:rPr>
+        <w:t xml:space="preserve"> SL</w:t>
+      </w:r>
+      <w:r>
+        <w:rPr>
+          <w:rFonts w:ascii="Manrope" w:hAnsi="Manrope"/>
+          <w:lang w:val="es-ES"/>
+        </w:rPr>
+        <w:t xml:space="preserve"> diseña y fabrica huertos verticales inteligentes para interiores. Imagínate una cascada de verdes vivos en la pared de tu salón en pleno centro de Madrid o Barcelona.</w:t>
       </w:r>
     </w:p>
     <w:p>
@@ -691,31 +981,76 @@
       <w:r>
         <w:rPr>
           <w:rFonts w:ascii="Manrope" w:hAnsi="Manrope"/>
-          <w:sz w:val="22"/>
-        </w:rPr>
-        <w:t xml:space="preserve">Lo realmente innovador no es solo la tecnología IoT que monitoriza la luz y el agua, sino nuestro enfoque de </w:t>
-      </w:r>
-      <w:r>
-        <w:rPr>
-          <w:rFonts w:ascii="Manrope" w:hAnsi="Manrope"/>
-          <w:b/>
-          <w:sz w:val="22"/>
-        </w:rPr>
-        <w:t>Economía Circular Urbana</w:t>
-      </w:r>
-      <w:r>
-        <w:rPr>
-          <w:rFonts w:ascii="Manrope" w:hAnsi="Manrope"/>
-          <w:sz w:val="22"/>
-        </w:rPr>
-        <w:t>. La app de Murgi SL no solo gestiona tu huerto, sino que te conecta con tus vecinos. ¿Que te sobran lechugas este mes? Puedes intercambiarlas por el excedente de limones de alguien de tres calles más allá. Queremos crear una red de "agricultura de guerrilla urbana" tecnológica y social.</w:t>
-      </w:r>
-      <w:r>
-        <w:rPr>
-          <w:rFonts w:ascii="Manrope" w:hAnsi="Manrope"/>
-          <w:sz w:val="22"/>
+          <w:lang w:val="es-ES"/>
+        </w:rPr>
+        <w:t xml:space="preserve">¿Dónde está la innovación?  La magia no es solo la maceta, es el "cerebro". Nuestros huertos llevan tecnología </w:t>
+      </w:r>
+      <w:proofErr w:type="spellStart"/>
+      <w:r>
+        <w:rPr>
+          <w:rFonts w:ascii="Manrope" w:hAnsi="Manrope"/>
+          <w:lang w:val="es-ES"/>
+        </w:rPr>
+        <w:t>IoT</w:t>
+      </w:r>
+      <w:proofErr w:type="spellEnd"/>
+      <w:r>
+        <w:rPr>
+          <w:rFonts w:ascii="Manrope" w:hAnsi="Manrope"/>
+          <w:lang w:val="es-ES"/>
+        </w:rPr>
+        <w:t xml:space="preserve"> (Internet de las Cosas).</w:t>
+      </w:r>
+      <w:r>
+        <w:rPr>
+          <w:rFonts w:ascii="Manrope" w:hAnsi="Manrope"/>
+          <w:lang w:val="es-ES"/>
         </w:rPr>
         <w:br/>
+      </w:r>
+      <w:r>
+        <w:rPr>
+          <w:rFonts w:ascii="Manrope" w:hAnsi="Manrope"/>
+          <w:lang w:val="es-ES"/>
+        </w:rPr>
+        <w:br/>
+      </w:r>
+      <w:r>
+        <w:rPr>
+          <w:rFonts w:ascii="Manrope" w:hAnsi="Manrope"/>
+          <w:lang w:val="es-ES"/>
+        </w:rPr>
+        <w:t xml:space="preserve">A través de una app móvil con un diseño UI/UX espectacular, el usuario controla el riego, la luz LED y los nutrientes. Es innovación pura porque democratiza el autoconsumo: ya no necesitas tener un jardín o saber de botánica para cultivar tus propios tomates </w:t>
+      </w:r>
+      <w:proofErr w:type="spellStart"/>
+      <w:r>
+        <w:rPr>
+          <w:rFonts w:ascii="Manrope" w:hAnsi="Manrope"/>
+          <w:lang w:val="es-ES"/>
+        </w:rPr>
+        <w:t>cherry</w:t>
+      </w:r>
+      <w:proofErr w:type="spellEnd"/>
+      <w:r>
+        <w:rPr>
+          <w:rFonts w:ascii="Manrope" w:hAnsi="Manrope"/>
+          <w:lang w:val="es-ES"/>
+        </w:rPr>
+        <w:t xml:space="preserve"> o albahac</w:t>
+      </w:r>
+      <w:r>
+        <w:rPr>
+          <w:rFonts w:ascii="Manrope" w:hAnsi="Manrope"/>
+          <w:lang w:val="es-ES"/>
+        </w:rPr>
+        <w:t>a,</w:t>
+      </w:r>
+      <w:r>
+        <w:rPr>
+          <w:rFonts w:ascii="Manrope" w:hAnsi="Manrope"/>
+          <w:lang w:val="es-ES"/>
+        </w:rPr>
+        <w:t xml:space="preserve"> nuestro sistema lo hace por ti.</w:t>
       </w:r>
       <w:r>
         <w:rPr>
@@ -773,12 +1108,166 @@
       </w:r>
     </w:p>
     <w:p>
-      <w:r>
-        <w:rPr>
-          <w:rFonts w:ascii="Manrope" w:hAnsi="Manrope"/>
-          <w:sz w:val="22"/>
-        </w:rPr>
-        <w:t>Para que esto funcione, no necesitamos una jerarquía rígida, sino un equipo que respire agilidad y pasión por lo verde y lo tecnológico.</w:t>
+      <w:pPr>
+        <w:ind w:firstLine="0"/>
+        <w:jc w:val="left"/>
+        <w:rPr>
+          <w:lang w:val="es-ES"/>
+        </w:rPr>
+      </w:pPr>
+      <w:r>
+        <w:rPr>
+          <w:b/>
+          <w:bCs/>
+          <w:lang w:val="es-ES"/>
+        </w:rPr>
+        <w:t>CEO (Dirección General):</w:t>
+      </w:r>
+      <w:r>
+        <w:rPr>
+          <w:lang w:val="es-ES"/>
+        </w:rPr>
+        <w:t xml:space="preserve"> El que marca el rumbo, busca la financiación y cierra alianzas estratégicas.</w:t>
+      </w:r>
+    </w:p>
+    <w:p>
+      <w:pPr>
+        <w:ind w:firstLine="0"/>
+        <w:jc w:val="left"/>
+        <w:rPr>
+          <w:lang w:val="es-ES"/>
+        </w:rPr>
+      </w:pPr>
+      <w:r>
+        <w:rPr>
+          <w:b/>
+          <w:bCs/>
+          <w:lang w:val="es-ES"/>
+        </w:rPr>
+        <w:t>CTO (</w:t>
+      </w:r>
+      <w:proofErr w:type="gramStart"/>
+      <w:r>
+        <w:rPr>
+          <w:b/>
+          <w:bCs/>
+          <w:lang w:val="es-ES"/>
+        </w:rPr>
+        <w:t>Responsable</w:t>
+      </w:r>
+      <w:proofErr w:type="gramEnd"/>
+      <w:r>
+        <w:rPr>
+          <w:b/>
+          <w:bCs/>
+          <w:lang w:val="es-ES"/>
+        </w:rPr>
+        <w:t xml:space="preserve"> de Hardware/Software):</w:t>
+      </w:r>
+      <w:r>
+        <w:rPr>
+          <w:lang w:val="es-ES"/>
+        </w:rPr>
+        <w:t xml:space="preserve"> La mente detrás de la placa base, los sensores </w:t>
+      </w:r>
+      <w:proofErr w:type="spellStart"/>
+      <w:r>
+        <w:rPr>
+          <w:lang w:val="es-ES"/>
+        </w:rPr>
+        <w:t>IoT</w:t>
+      </w:r>
+      <w:proofErr w:type="spellEnd"/>
+      <w:r>
+        <w:rPr>
+          <w:lang w:val="es-ES"/>
+        </w:rPr>
+        <w:t xml:space="preserve"> y la app.</w:t>
+      </w:r>
+    </w:p>
+    <w:p>
+      <w:pPr>
+        <w:ind w:firstLine="0"/>
+        <w:jc w:val="left"/>
+        <w:rPr>
+          <w:lang w:val="es-ES"/>
+        </w:rPr>
+      </w:pPr>
+      <w:r>
+        <w:rPr>
+          <w:b/>
+          <w:bCs/>
+          <w:lang w:val="es-ES"/>
+        </w:rPr>
+        <w:t>CMO (</w:t>
+      </w:r>
+      <w:proofErr w:type="gramStart"/>
+      <w:r>
+        <w:rPr>
+          <w:b/>
+          <w:bCs/>
+          <w:lang w:val="es-ES"/>
+        </w:rPr>
+        <w:t>Responsable</w:t>
+      </w:r>
+      <w:proofErr w:type="gramEnd"/>
+      <w:r>
+        <w:rPr>
+          <w:b/>
+          <w:bCs/>
+          <w:lang w:val="es-ES"/>
+        </w:rPr>
+        <w:t xml:space="preserve"> de Marketing y Ventas):</w:t>
+      </w:r>
+      <w:r>
+        <w:rPr>
+          <w:lang w:val="es-ES"/>
+        </w:rPr>
+        <w:t xml:space="preserve"> Encargado de enamorar al cliente, llevar las redes y vender esa idea de "hogar verde y conectado".</w:t>
+      </w:r>
+    </w:p>
+    <w:p>
+      <w:pPr>
+        <w:ind w:firstLine="0"/>
+        <w:jc w:val="left"/>
+      </w:pPr>
+      <w:r>
+        <w:rPr>
+          <w:b/>
+          <w:bCs/>
+          <w:lang w:val="es-ES"/>
+        </w:rPr>
+        <w:t>COO (</w:t>
+      </w:r>
+      <w:proofErr w:type="gramStart"/>
+      <w:r>
+        <w:rPr>
+          <w:b/>
+          <w:bCs/>
+          <w:lang w:val="es-ES"/>
+        </w:rPr>
+        <w:t>Responsable</w:t>
+      </w:r>
+      <w:proofErr w:type="gramEnd"/>
+      <w:r>
+        <w:rPr>
+          <w:b/>
+          <w:bCs/>
+          <w:lang w:val="es-ES"/>
+        </w:rPr>
+        <w:t xml:space="preserve"> de Operaciones):</w:t>
+      </w:r>
+      <w:r>
+        <w:rPr>
+          <w:lang w:val="es-ES"/>
+        </w:rPr>
+        <w:t xml:space="preserve"> Quien se pelea con los proveedores para que los plazos de entrega y el ensamblaje de los huertos salgan a tiempo.</w:t>
+      </w:r>
+      <w:r>
+        <w:rPr>
+          <w:lang w:val="es-ES"/>
+        </w:rPr>
+        <w:br/>
       </w:r>
     </w:p>
     <w:p>
@@ -789,7 +1278,7 @@
           <w:color w:val="003594"/>
           <w:sz w:val="28"/>
         </w:rPr>
-        <w:t xml:space="preserve">El </w:t>
+        <w:t xml:space="preserve">Necesidades de </w:t>
       </w:r>
       <w:r>
         <w:rPr>
@@ -798,7 +1287,7 @@
           <w:color w:val="003594"/>
           <w:sz w:val="28"/>
         </w:rPr>
-        <w:t>o</w:t>
+        <w:t>r</w:t>
       </w:r>
       <w:r>
         <w:rPr>
@@ -807,7 +1296,7 @@
           <w:color w:val="003594"/>
           <w:sz w:val="28"/>
         </w:rPr>
-        <w:t>rganigrama</w:t>
+        <w:t xml:space="preserve">ecursos </w:t>
       </w:r>
       <w:r>
         <w:rPr>
@@ -816,203 +1305,8 @@
           <w:color w:val="003594"/>
           <w:sz w:val="28"/>
         </w:rPr>
-        <w:t>.</w:t>
-      </w:r>
-    </w:p>
-    <w:p>
-      <w:r>
-        <w:rPr>
-          <w:rFonts w:ascii="Manrope" w:hAnsi="Manrope"/>
-          <w:sz w:val="22"/>
-        </w:rPr>
-        <w:t>Hemos optado por una estructura funcional, pero muy colaborativa:</w:t>
-      </w:r>
-    </w:p>
-    <w:p>
-      <w:r>
-        <w:rPr>
-          <w:rFonts w:ascii="Manrope" w:hAnsi="Manrope"/>
-        </w:rPr>
-        <w:t xml:space="preserve">• </w:t>
-      </w:r>
-      <w:r>
-        <w:rPr>
-          <w:rFonts w:ascii="Manrope" w:hAnsi="Manrope"/>
-          <w:sz w:val="22"/>
-        </w:rPr>
-        <w:t xml:space="preserve">  </w:t>
-      </w:r>
-      <w:r>
-        <w:rPr>
-          <w:rFonts w:ascii="Manrope" w:hAnsi="Manrope"/>
-          <w:b/>
-          <w:sz w:val="22"/>
-        </w:rPr>
-        <w:t xml:space="preserve">Dirección </w:t>
-      </w:r>
-      <w:r>
-        <w:rPr>
-          <w:rFonts w:ascii="Manrope" w:hAnsi="Manrope"/>
-          <w:b/>
-          <w:sz w:val="22"/>
-        </w:rPr>
-        <w:t>e</w:t>
-      </w:r>
-      <w:r>
-        <w:rPr>
-          <w:rFonts w:ascii="Manrope" w:hAnsi="Manrope"/>
-          <w:b/>
-          <w:sz w:val="22"/>
-        </w:rPr>
-        <w:t>stratégica:</w:t>
-      </w:r>
-      <w:r>
-        <w:rPr>
-          <w:rFonts w:ascii="Manrope" w:hAnsi="Manrope"/>
-          <w:sz w:val="22"/>
-        </w:rPr>
-        <w:t xml:space="preserve"> Encargada de que no perdamos el norte y de las alianzas clave.</w:t>
-      </w:r>
-    </w:p>
-    <w:p>
-      <w:r>
-        <w:rPr>
-          <w:rFonts w:ascii="Manrope" w:hAnsi="Manrope"/>
-        </w:rPr>
-        <w:t xml:space="preserve">• </w:t>
-      </w:r>
-      <w:r>
-        <w:rPr>
-          <w:rFonts w:ascii="Manrope" w:hAnsi="Manrope"/>
-          <w:sz w:val="22"/>
-        </w:rPr>
-        <w:t xml:space="preserve">  </w:t>
-      </w:r>
-      <w:r>
-        <w:rPr>
-          <w:rFonts w:ascii="Manrope" w:hAnsi="Manrope"/>
-          <w:b/>
-          <w:sz w:val="22"/>
-        </w:rPr>
-        <w:t xml:space="preserve">Área de I+D y </w:t>
-      </w:r>
-      <w:r>
-        <w:rPr>
-          <w:rFonts w:ascii="Manrope" w:hAnsi="Manrope"/>
-          <w:b/>
-          <w:sz w:val="22"/>
-        </w:rPr>
-        <w:t>t</w:t>
-      </w:r>
-      <w:r>
-        <w:rPr>
-          <w:rFonts w:ascii="Manrope" w:hAnsi="Manrope"/>
-          <w:b/>
-          <w:sz w:val="22"/>
-        </w:rPr>
-        <w:t>ecnología:</w:t>
-      </w:r>
-      <w:r>
-        <w:rPr>
-          <w:rFonts w:ascii="Manrope" w:hAnsi="Manrope"/>
-          <w:sz w:val="22"/>
-        </w:rPr>
-        <w:t xml:space="preserve"> El "cerebro" donde se diseñan los sensores y se pule la app.</w:t>
-      </w:r>
-    </w:p>
-    <w:p>
-      <w:r>
-        <w:rPr>
-          <w:rFonts w:ascii="Manrope" w:hAnsi="Manrope"/>
-        </w:rPr>
-        <w:t xml:space="preserve">• </w:t>
-      </w:r>
-      <w:r>
-        <w:rPr>
-          <w:rFonts w:ascii="Manrope" w:hAnsi="Manrope"/>
-          <w:sz w:val="22"/>
-        </w:rPr>
-        <w:t xml:space="preserve">  </w:t>
-      </w:r>
-      <w:r>
-        <w:rPr>
-          <w:rFonts w:ascii="Manrope" w:hAnsi="Manrope"/>
-          <w:b/>
-          <w:sz w:val="22"/>
-        </w:rPr>
-        <w:t xml:space="preserve">Operaciones y </w:t>
-      </w:r>
-      <w:r>
-        <w:rPr>
-          <w:rFonts w:ascii="Manrope" w:hAnsi="Manrope"/>
-          <w:b/>
-          <w:sz w:val="22"/>
-        </w:rPr>
-        <w:t>l</w:t>
-      </w:r>
-      <w:r>
-        <w:rPr>
-          <w:rFonts w:ascii="Manrope" w:hAnsi="Manrope"/>
-          <w:b/>
-          <w:sz w:val="22"/>
-        </w:rPr>
-        <w:t>ogística:</w:t>
-      </w:r>
-      <w:r>
-        <w:rPr>
-          <w:rFonts w:ascii="Manrope" w:hAnsi="Manrope"/>
-          <w:sz w:val="22"/>
-        </w:rPr>
-        <w:t xml:space="preserve"> Quienes aseguran que los kits lleguen a tiempo y que el soporte post-venta sea impecable.</w:t>
-      </w:r>
-    </w:p>
-    <w:p>
-      <w:r>
-        <w:rPr>
-          <w:rFonts w:ascii="Manrope" w:hAnsi="Manrope"/>
-        </w:rPr>
-        <w:t xml:space="preserve">• </w:t>
-      </w:r>
-      <w:r>
-        <w:rPr>
-          <w:rFonts w:ascii="Manrope" w:hAnsi="Manrope"/>
-          <w:sz w:val="22"/>
-        </w:rPr>
-        <w:t xml:space="preserve">  </w:t>
-      </w:r>
-      <w:r>
-        <w:rPr>
-          <w:rFonts w:ascii="Manrope" w:hAnsi="Manrope"/>
-          <w:b/>
-          <w:sz w:val="22"/>
-        </w:rPr>
-        <w:t xml:space="preserve">Marketing y </w:t>
-      </w:r>
-      <w:r>
-        <w:rPr>
-          <w:rFonts w:ascii="Manrope" w:hAnsi="Manrope"/>
-          <w:b/>
-          <w:sz w:val="22"/>
-        </w:rPr>
-        <w:t>c</w:t>
-      </w:r>
-      <w:r>
-        <w:rPr>
-          <w:rFonts w:ascii="Manrope" w:hAnsi="Manrope"/>
-          <w:b/>
-          <w:sz w:val="22"/>
-        </w:rPr>
-        <w:t>omunidad:</w:t>
-      </w:r>
-      <w:r>
-        <w:rPr>
-          <w:rFonts w:ascii="Manrope" w:hAnsi="Manrope"/>
-          <w:sz w:val="22"/>
-        </w:rPr>
-        <w:t xml:space="preserve"> El alma de la empresa, encargados de dinamizar esa red social de intercambio.</w:t>
-      </w:r>
-    </w:p>
-    <w:p>
+        <w:t>h</w:t>
+      </w:r>
       <w:r>
         <w:rPr>
           <w:rFonts w:ascii="Manrope" w:hAnsi="Manrope"/>
@@ -1020,7 +1314,7 @@
           <w:color w:val="003594"/>
           <w:sz w:val="28"/>
         </w:rPr>
-        <w:t xml:space="preserve">Necesidades de </w:t>
+        <w:t xml:space="preserve">umanos y </w:t>
       </w:r>
       <w:r>
         <w:rPr>
@@ -1029,7 +1323,7 @@
           <w:color w:val="003594"/>
           <w:sz w:val="28"/>
         </w:rPr>
-        <w:t>r</w:t>
+        <w:t>m</w:t>
       </w:r>
       <w:r>
         <w:rPr>
@@ -1038,8 +1332,145 @@
           <w:color w:val="003594"/>
           <w:sz w:val="28"/>
         </w:rPr>
-        <w:t xml:space="preserve">ecursos </w:t>
-      </w:r>
+        <w:t>ateriales</w:t>
+      </w:r>
+    </w:p>
+    <w:p>
+      <w:pPr>
+        <w:ind w:firstLine="0"/>
+        <w:jc w:val="left"/>
+      </w:pPr>
+      <w:r>
+        <w:rPr>
+          <w:rFonts w:ascii="Manrope" w:hAnsi="Manrope"/>
+          <w:b/>
+        </w:rPr>
+        <w:t>Lo humano:</w:t>
+      </w:r>
+      <w:r>
+        <w:rPr>
+          <w:rFonts w:ascii="Manrope" w:hAnsi="Manrope"/>
+        </w:rPr>
+        <w:t xml:space="preserve"> Al principio, seremos un equipo pequeño pero multidisciplinar. Necesitaremos un ingeniero de software, un experto en agronomía hidropónica y dos personas volcadas en la experiencia del cliente (porque queremos que se sientan acompañados en su proceso de cultivo).</w:t>
+      </w:r>
+    </w:p>
+    <w:p>
+      <w:pPr>
+        <w:ind w:firstLine="0"/>
+        <w:jc w:val="left"/>
+      </w:pPr>
+      <w:r>
+        <w:rPr>
+          <w:rFonts w:ascii="Manrope" w:hAnsi="Manrope"/>
+          <w:b/>
+        </w:rPr>
+        <w:t>Lo material:</w:t>
+      </w:r>
+      <w:r>
+        <w:rPr>
+          <w:rFonts w:ascii="Manrope" w:hAnsi="Manrope"/>
+        </w:rPr>
+        <w:t xml:space="preserve"> No hace falta una fábrica gigante. Trabajaremos con un centro de ensamblaje local y un almacén de logística para los componentes electrónicos y las semillas orgánicas. Lo más importante aquí es nuestro "Hub de </w:t>
+      </w:r>
+      <w:r>
+        <w:rPr>
+          <w:rFonts w:ascii="Manrope" w:hAnsi="Manrope"/>
+        </w:rPr>
+        <w:t>c</w:t>
+      </w:r>
+      <w:r>
+        <w:rPr>
+          <w:rFonts w:ascii="Manrope" w:hAnsi="Manrope"/>
+        </w:rPr>
+        <w:t xml:space="preserve">ontrol", desde donde monitorizamos que todos los sistemas </w:t>
+      </w:r>
+      <w:proofErr w:type="spellStart"/>
+      <w:r>
+        <w:rPr>
+          <w:rFonts w:ascii="Manrope" w:hAnsi="Manrope"/>
+        </w:rPr>
+        <w:t>Murgi</w:t>
+      </w:r>
+      <w:proofErr w:type="spellEnd"/>
+      <w:r>
+        <w:rPr>
+          <w:rFonts w:ascii="Manrope" w:hAnsi="Manrope"/>
+        </w:rPr>
+        <w:t xml:space="preserve"> SL de nuestros clientes estén funcionando como un reloj.</w:t>
+      </w:r>
+      <w:r>
+        <w:rPr>
+          <w:rFonts w:ascii="Manrope" w:hAnsi="Manrope"/>
+        </w:rPr>
+        <w:br/>
+      </w:r>
+    </w:p>
+    <w:p>
+      <w:r>
+        <w:rPr>
+          <w:rFonts w:ascii="Manrope" w:hAnsi="Manrope"/>
+          <w:b/>
+          <w:color w:val="003594"/>
+          <w:sz w:val="36"/>
+        </w:rPr>
+        <w:lastRenderedPageBreak/>
+        <w:t xml:space="preserve">4. Estudio de </w:t>
+      </w:r>
+      <w:r>
+        <w:rPr>
+          <w:rFonts w:ascii="Manrope" w:hAnsi="Manrope"/>
+          <w:b/>
+          <w:color w:val="003594"/>
+          <w:sz w:val="36"/>
+        </w:rPr>
+        <w:t>m</w:t>
+      </w:r>
+      <w:r>
+        <w:rPr>
+          <w:rFonts w:ascii="Manrope" w:hAnsi="Manrope"/>
+          <w:b/>
+          <w:color w:val="003594"/>
+          <w:sz w:val="36"/>
+        </w:rPr>
+        <w:t>ercado</w:t>
+      </w:r>
+    </w:p>
+    <w:p>
+      <w:pPr>
+        <w:jc w:val="left"/>
+      </w:pPr>
+      <w:r>
+        <w:rPr>
+          <w:rFonts w:ascii="Manrope" w:hAnsi="Manrope"/>
+          <w:sz w:val="22"/>
+        </w:rPr>
+        <w:t xml:space="preserve">Si vamos a lanzar </w:t>
+      </w:r>
+      <w:proofErr w:type="spellStart"/>
+      <w:r>
+        <w:rPr>
+          <w:rFonts w:ascii="Manrope" w:hAnsi="Manrope"/>
+          <w:sz w:val="22"/>
+        </w:rPr>
+        <w:t>Murgi</w:t>
+      </w:r>
+      <w:proofErr w:type="spellEnd"/>
+      <w:r>
+        <w:rPr>
+          <w:rFonts w:ascii="Manrope" w:hAnsi="Manrope"/>
+          <w:sz w:val="22"/>
+        </w:rPr>
+        <w:t xml:space="preserve"> SL, lo primero es saber a quién le estamos hablando y en qué terreno estamos pisando. No se trata solo de números, sino de entender el estilo de vida actual.</w:t>
+      </w:r>
+      <w:r>
+        <w:rPr>
+          <w:rFonts w:ascii="Manrope" w:hAnsi="Manrope"/>
+          <w:sz w:val="22"/>
+        </w:rPr>
+        <w:br/>
+      </w:r>
+    </w:p>
+    <w:p>
       <w:r>
         <w:rPr>
           <w:rFonts w:ascii="Manrope" w:hAnsi="Manrope"/>
@@ -1047,7 +1478,7 @@
           <w:color w:val="003594"/>
           <w:sz w:val="28"/>
         </w:rPr>
-        <w:t>h</w:t>
+        <w:t xml:space="preserve">Público </w:t>
       </w:r>
       <w:r>
         <w:rPr>
@@ -1056,7 +1487,7 @@
           <w:color w:val="003594"/>
           <w:sz w:val="28"/>
         </w:rPr>
-        <w:t xml:space="preserve">umanos y </w:t>
+        <w:t>o</w:t>
       </w:r>
       <w:r>
         <w:rPr>
@@ -1065,8 +1496,48 @@
           <w:color w:val="003594"/>
           <w:sz w:val="28"/>
         </w:rPr>
-        <w:t>m</w:t>
-      </w:r>
+        <w:t>bjetivo: ¿Quién nos necesita?</w:t>
+      </w:r>
+    </w:p>
+    <w:p>
+      <w:pPr>
+        <w:jc w:val="left"/>
+      </w:pPr>
+      <w:r>
+        <w:rPr>
+          <w:rFonts w:ascii="Manrope" w:hAnsi="Manrope"/>
+        </w:rPr>
+        <w:t xml:space="preserve">Nos dirigimos a los </w:t>
+      </w:r>
+      <w:r>
+        <w:rPr>
+          <w:rFonts w:ascii="Manrope" w:hAnsi="Manrope"/>
+          <w:b/>
+        </w:rPr>
+        <w:t>"Eco-Urbanitas"</w:t>
+      </w:r>
+      <w:r>
+        <w:rPr>
+          <w:rFonts w:ascii="Manrope" w:hAnsi="Manrope"/>
+        </w:rPr>
+        <w:t>. Gente de entre 25 y 50 años que vive en núcleos urbanos densos. Son personas que valoran la sostenibilidad, que están hartas de que la verdura del super no sepa a nada y que, aunque tienen poco tiempo, disfrutan de la tecnología que les facilita la vida. También hemos visto un nicho interesante en familias con niños pequeños que quieren usar el huerto como una herramienta educativa en casa</w:t>
+      </w:r>
+      <w:r>
+        <w:rPr>
+          <w:rFonts w:ascii="Manrope" w:hAnsi="Manrope"/>
+          <w:sz w:val="22"/>
+        </w:rPr>
+        <w:t>.</w:t>
+      </w:r>
+      <w:r>
+        <w:rPr>
+          <w:rFonts w:ascii="Manrope" w:hAnsi="Manrope"/>
+          <w:sz w:val="22"/>
+        </w:rPr>
+        <w:br/>
+      </w:r>
+    </w:p>
+    <w:p>
       <w:r>
         <w:rPr>
           <w:rFonts w:ascii="Manrope" w:hAnsi="Manrope"/>
@@ -1074,86 +1545,8 @@
           <w:color w:val="003594"/>
           <w:sz w:val="28"/>
         </w:rPr>
-        <w:t>ateriales</w:t>
-      </w:r>
-    </w:p>
-    <w:p>
-      <w:r>
-        <w:rPr>
-          <w:rFonts w:ascii="Manrope" w:hAnsi="Manrope"/>
-          <w:b/>
-          <w:sz w:val="22"/>
-        </w:rPr>
-        <w:t>Lo humano:</w:t>
-      </w:r>
-      <w:r>
-        <w:rPr>
-          <w:rFonts w:ascii="Manrope" w:hAnsi="Manrope"/>
-          <w:sz w:val="22"/>
-        </w:rPr>
-        <w:t xml:space="preserve"> Al principio, seremos un equipo pequeño pero multidisciplinar. Necesitaremos un ingeniero de software, un experto en agronomía hidropónica y dos personas volcadas en la experiencia del cliente (porque queremos que se sientan acompañados en su proceso de cultivo).</w:t>
-      </w:r>
-    </w:p>
-    <w:p>
-      <w:r>
-        <w:rPr>
-          <w:rFonts w:ascii="Manrope" w:hAnsi="Manrope"/>
-          <w:b/>
-          <w:sz w:val="22"/>
-        </w:rPr>
-        <w:t>Lo material:</w:t>
-      </w:r>
-      <w:r>
-        <w:rPr>
-          <w:rFonts w:ascii="Manrope" w:hAnsi="Manrope"/>
-          <w:sz w:val="22"/>
-        </w:rPr>
-        <w:t xml:space="preserve"> No hace falta una fábrica gigante. Trabajaremos con un centro de ensamblaje local y un almacén de logística para los componentes electrónicos y las semillas orgánicas. Lo más importante aquí es nuestro "Hub de Control", desde donde monitorizamos que todos los sistemas Murgi SL de nuestros clientes estén funcionando como un reloj.</w:t>
-      </w:r>
-      <w:r>
-        <w:br w:type="page"/>
-      </w:r>
-    </w:p>
-    <w:p>
-      <w:r>
-        <w:rPr>
-          <w:rFonts w:ascii="Manrope" w:hAnsi="Manrope"/>
-          <w:b/>
-          <w:color w:val="003594"/>
-          <w:sz w:val="36"/>
-        </w:rPr>
-        <w:lastRenderedPageBreak/>
-        <w:t xml:space="preserve">4. Estudio de </w:t>
-      </w:r>
-      <w:r>
-        <w:rPr>
-          <w:rFonts w:ascii="Manrope" w:hAnsi="Manrope"/>
-          <w:b/>
-          <w:color w:val="003594"/>
-          <w:sz w:val="36"/>
-        </w:rPr>
-        <w:t>m</w:t>
-      </w:r>
-      <w:r>
-        <w:rPr>
-          <w:rFonts w:ascii="Manrope" w:hAnsi="Manrope"/>
-          <w:b/>
-          <w:color w:val="003594"/>
-          <w:sz w:val="36"/>
-        </w:rPr>
-        <w:t>ercado</w:t>
-      </w:r>
-    </w:p>
-    <w:p>
-      <w:r>
-        <w:rPr>
-          <w:rFonts w:ascii="Manrope" w:hAnsi="Manrope"/>
-          <w:sz w:val="22"/>
-        </w:rPr>
-        <w:t>Si vamos a lanzar Murgi SL, lo primero es saber a quién le estamos hablando y en qué terreno estamos pisando. No se trata solo de números, sino de entender el estilo de vida actual.</w:t>
-      </w:r>
-    </w:p>
-    <w:p>
+        <w:t xml:space="preserve">Análisis de la </w:t>
+      </w:r>
       <w:r>
         <w:rPr>
           <w:rFonts w:ascii="Manrope" w:hAnsi="Manrope"/>
@@ -1161,7 +1554,7 @@
           <w:color w:val="003594"/>
           <w:sz w:val="28"/>
         </w:rPr>
-        <w:t xml:space="preserve">Público </w:t>
+        <w:t>c</w:t>
       </w:r>
       <w:r>
         <w:rPr>
@@ -1170,8 +1563,50 @@
           <w:color w:val="003594"/>
           <w:sz w:val="28"/>
         </w:rPr>
-        <w:t>o</w:t>
-      </w:r>
+        <w:t>ompetencia</w:t>
+      </w:r>
+    </w:p>
+    <w:p>
+      <w:pPr>
+        <w:jc w:val="left"/>
+      </w:pPr>
+      <w:r>
+        <w:rPr>
+          <w:rFonts w:ascii="Manrope" w:hAnsi="Manrope"/>
+        </w:rPr>
+        <w:t>La competencia "clásica" son las tiendas de jardinería o kits de cultivo de Amazon. ¿Su problema? Son pasivos. Si te olvidas de regar, la planta muere. Nosotros somos activos.</w:t>
+      </w:r>
+    </w:p>
+    <w:p>
+      <w:pPr>
+        <w:jc w:val="left"/>
+        <w:rPr>
+          <w:rFonts w:ascii="Manrope" w:hAnsi="Manrope"/>
+          <w:sz w:val="22"/>
+        </w:rPr>
+      </w:pPr>
+      <w:r>
+        <w:rPr>
+          <w:rFonts w:ascii="Manrope" w:hAnsi="Manrope"/>
+        </w:rPr>
+        <w:t>Internamente, nuestra fortaleza es la tecnología propia y la comunidad. Externamente, el mayor reto es la percepción del precio inicial del kit, pero lo combatimos con el ahorro a largo plazo en la cesta de la compra</w:t>
+      </w:r>
+      <w:r>
+        <w:rPr>
+          <w:rFonts w:ascii="Manrope" w:hAnsi="Manrope"/>
+          <w:sz w:val="22"/>
+        </w:rPr>
+        <w:t>.</w:t>
+      </w:r>
+      <w:r>
+        <w:rPr>
+          <w:rFonts w:ascii="Manrope" w:hAnsi="Manrope"/>
+          <w:sz w:val="22"/>
+        </w:rPr>
+        <w:br/>
+      </w:r>
+    </w:p>
+    <w:p>
       <w:r>
         <w:rPr>
           <w:rFonts w:ascii="Manrope" w:hAnsi="Manrope"/>
@@ -1179,31 +1614,124 @@
           <w:color w:val="003594"/>
           <w:sz w:val="28"/>
         </w:rPr>
-        <w:t>bjetivo: ¿Quién nos necesita?</w:t>
-      </w:r>
-    </w:p>
-    <w:p>
-      <w:r>
-        <w:rPr>
-          <w:rFonts w:ascii="Manrope" w:hAnsi="Manrope"/>
-          <w:sz w:val="22"/>
-        </w:rPr>
-        <w:t xml:space="preserve">Nos dirigimos a los </w:t>
-      </w:r>
-      <w:r>
-        <w:rPr>
-          <w:rFonts w:ascii="Manrope" w:hAnsi="Manrope"/>
-          <w:b/>
-          <w:sz w:val="22"/>
-        </w:rPr>
-        <w:t>"Eco-Urbanitas"</w:t>
-      </w:r>
-      <w:r>
-        <w:rPr>
-          <w:rFonts w:ascii="Manrope" w:hAnsi="Manrope"/>
-          <w:sz w:val="22"/>
-        </w:rPr>
-        <w:t>. Gente de entre 25 y 50 años que vive en núcleos urbanos densos. Son personas que valoran la sostenibilidad, que están hartas de que la verdura del super no sepa a nada y que, aunque tienen poco tiempo, disfrutan de la tecnología que les facilita la vida. También hemos visto un nicho interesante en familias con niños pequeños que quieren usar el huerto como una herramienta educativa en casa.</w:t>
+        <w:t>Análisis PEST (El entorno)</w:t>
+      </w:r>
+    </w:p>
+    <w:p>
+      <w:r>
+        <w:rPr>
+          <w:rFonts w:ascii="Manrope" w:hAnsi="Manrope"/>
+        </w:rPr>
+        <w:t>Para entender dónde estamos, echemos un ojo a lo que nos rodea:</w:t>
+      </w:r>
+    </w:p>
+    <w:p>
+      <w:pPr>
+        <w:jc w:val="left"/>
+      </w:pPr>
+      <w:r>
+        <w:rPr>
+          <w:rFonts w:ascii="Manrope" w:hAnsi="Manrope"/>
+          <w:b/>
+        </w:rPr>
+        <w:t>Político:</w:t>
+      </w:r>
+      <w:r>
+        <w:rPr>
+          <w:rFonts w:ascii="Manrope" w:hAnsi="Manrope"/>
+        </w:rPr>
+        <w:t xml:space="preserve"> Cada vez hay más normativas europeas que fomentan la sostenibilidad y el autocultivo urbano. ¡Es el momento perfecto!</w:t>
+      </w:r>
+    </w:p>
+    <w:p>
+      <w:pPr>
+        <w:jc w:val="left"/>
+      </w:pPr>
+      <w:r>
+        <w:rPr>
+          <w:rFonts w:ascii="Manrope" w:hAnsi="Manrope"/>
+          <w:b/>
+        </w:rPr>
+        <w:t>Económico:</w:t>
+      </w:r>
+      <w:r>
+        <w:rPr>
+          <w:rFonts w:ascii="Manrope" w:hAnsi="Manrope"/>
+        </w:rPr>
+        <w:t xml:space="preserve"> Aunque la inflación aprieta, la gente está dispuesta a invertir en salud y en reducir su huella de carbono si eso </w:t>
+      </w:r>
+      <w:proofErr w:type="gramStart"/>
+      <w:r>
+        <w:rPr>
+          <w:rFonts w:ascii="Manrope" w:hAnsi="Manrope"/>
+        </w:rPr>
+        <w:t>les</w:t>
+      </w:r>
+      <w:proofErr w:type="gramEnd"/>
+      <w:r>
+        <w:rPr>
+          <w:rFonts w:ascii="Manrope" w:hAnsi="Manrope"/>
+        </w:rPr>
+        <w:t xml:space="preserve"> ahorra dinero a futuro.</w:t>
+      </w:r>
+    </w:p>
+    <w:p>
+      <w:pPr>
+        <w:jc w:val="left"/>
+      </w:pPr>
+      <w:r>
+        <w:rPr>
+          <w:rFonts w:ascii="Manrope" w:hAnsi="Manrope"/>
+          <w:b/>
+        </w:rPr>
+        <w:t>Social:</w:t>
+      </w:r>
+      <w:r>
+        <w:rPr>
+          <w:rFonts w:ascii="Manrope" w:hAnsi="Manrope"/>
+        </w:rPr>
+        <w:t xml:space="preserve"> Hay un hambre real (y nunca mejor dicho) de productos "kilómetro cero" y de reconectar con lo natural.</w:t>
+      </w:r>
+    </w:p>
+    <w:p>
+      <w:pPr>
+        <w:jc w:val="left"/>
+        <w:rPr>
+          <w:rFonts w:ascii="Manrope" w:hAnsi="Manrope"/>
+        </w:rPr>
+      </w:pPr>
+      <w:r>
+        <w:rPr>
+          <w:rFonts w:ascii="Manrope" w:hAnsi="Manrope"/>
+          <w:b/>
+        </w:rPr>
+        <w:t>Tecnológico:</w:t>
+      </w:r>
+      <w:r>
+        <w:rPr>
+          <w:rFonts w:ascii="Manrope" w:hAnsi="Manrope"/>
+        </w:rPr>
+        <w:t xml:space="preserve"> El avance del </w:t>
+      </w:r>
+      <w:proofErr w:type="spellStart"/>
+      <w:r>
+        <w:rPr>
+          <w:rFonts w:ascii="Manrope" w:hAnsi="Manrope"/>
+        </w:rPr>
+        <w:t>IoT</w:t>
+      </w:r>
+      <w:proofErr w:type="spellEnd"/>
+      <w:r>
+        <w:rPr>
+          <w:rFonts w:ascii="Manrope" w:hAnsi="Manrope"/>
+        </w:rPr>
+        <w:t xml:space="preserve"> y la IA nos permite democratizar técnicas que antes eran solo para profesionales.</w:t>
+      </w:r>
+      <w:r>
+        <w:rPr>
+          <w:rFonts w:ascii="Manrope" w:hAnsi="Manrope"/>
+        </w:rPr>
+        <w:br/>
       </w:r>
     </w:p>
     <w:p>
@@ -1214,7 +1742,8 @@
           <w:color w:val="003594"/>
           <w:sz w:val="28"/>
         </w:rPr>
-        <w:t xml:space="preserve">Análisis de la </w:t>
+        <w:lastRenderedPageBreak/>
+        <w:t>Matriz DAFO</w:t>
       </w:r>
       <w:r>
         <w:rPr>
@@ -1223,217 +1752,7 @@
           <w:color w:val="003594"/>
           <w:sz w:val="28"/>
         </w:rPr>
-        <w:t>c</w:t>
-      </w:r>
-      <w:r>
-        <w:rPr>
-          <w:rFonts w:ascii="Manrope" w:hAnsi="Manrope"/>
-          <w:b/>
-          <w:color w:val="003594"/>
-          <w:sz w:val="28"/>
-        </w:rPr>
-        <w:t>ompetencia</w:t>
-      </w:r>
-    </w:p>
-    <w:p>
-      <w:r>
-        <w:rPr>
-          <w:rFonts w:ascii="Manrope" w:hAnsi="Manrope"/>
-          <w:sz w:val="22"/>
-        </w:rPr>
-        <w:t>La competencia "clásica" son las tiendas de jardinería o kits de cultivo de Amazon. ¿Su problema? Son pasivos. Si te olvidas de regar, la planta muere. Nosotros somos activos.</w:t>
-      </w:r>
-    </w:p>
-    <w:p>
-      <w:r>
-        <w:rPr>
-          <w:rFonts w:ascii="Manrope" w:hAnsi="Manrope"/>
-          <w:sz w:val="22"/>
-        </w:rPr>
-        <w:t>Internamente, nuestra fortaleza es la tecnología propia y la comunidad. Externamente, el mayor reto es la percepción del precio inicial del kit, pero lo combatimos con el ahorro a largo plazo en la cesta de la compra.</w:t>
-      </w:r>
-    </w:p>
-    <w:p>
-      <w:r>
-        <w:rPr>
-          <w:rFonts w:ascii="Manrope" w:hAnsi="Manrope"/>
-          <w:b/>
-          <w:color w:val="003594"/>
-          <w:sz w:val="28"/>
-        </w:rPr>
-        <w:t>Análisis PEST (El entorno)</w:t>
-      </w:r>
-    </w:p>
-    <w:p>
-      <w:r>
-        <w:rPr>
-          <w:rFonts w:ascii="Manrope" w:hAnsi="Manrope"/>
-          <w:sz w:val="22"/>
-        </w:rPr>
-        <w:t>Para entender dónde estamos, echemos un ojo a lo que nos rodea:</w:t>
-      </w:r>
-    </w:p>
-    <w:p>
-      <w:r>
-        <w:rPr>
-          <w:rFonts w:ascii="Manrope" w:hAnsi="Manrope"/>
-        </w:rPr>
-        <w:t xml:space="preserve">• </w:t>
-      </w:r>
-      <w:r>
-        <w:rPr>
-          <w:rFonts w:ascii="Manrope" w:hAnsi="Manrope"/>
-          <w:sz w:val="22"/>
-        </w:rPr>
-        <w:t xml:space="preserve">  </w:t>
-      </w:r>
-      <w:r>
-        <w:rPr>
-          <w:rFonts w:ascii="Manrope" w:hAnsi="Manrope"/>
-          <w:b/>
-          <w:sz w:val="22"/>
-        </w:rPr>
-        <w:t>Político:</w:t>
-      </w:r>
-      <w:r>
-        <w:rPr>
-          <w:rFonts w:ascii="Manrope" w:hAnsi="Manrope"/>
-          <w:sz w:val="22"/>
-        </w:rPr>
-        <w:t xml:space="preserve"> Cada vez hay más normativas europeas que fomentan la sostenibilidad y el autocultivo urbano. ¡Es el momento perfecto!</w:t>
-      </w:r>
-    </w:p>
-    <w:p>
-      <w:r>
-        <w:rPr>
-          <w:rFonts w:ascii="Manrope" w:hAnsi="Manrope"/>
-        </w:rPr>
-        <w:t xml:space="preserve">• </w:t>
-      </w:r>
-      <w:r>
-        <w:rPr>
-          <w:rFonts w:ascii="Manrope" w:hAnsi="Manrope"/>
-          <w:sz w:val="22"/>
-        </w:rPr>
-        <w:t xml:space="preserve">  </w:t>
-      </w:r>
-      <w:r>
-        <w:rPr>
-          <w:rFonts w:ascii="Manrope" w:hAnsi="Manrope"/>
-          <w:b/>
-          <w:sz w:val="22"/>
-        </w:rPr>
-        <w:t>Económico:</w:t>
-      </w:r>
-      <w:r>
-        <w:rPr>
-          <w:rFonts w:ascii="Manrope" w:hAnsi="Manrope"/>
-          <w:sz w:val="22"/>
-        </w:rPr>
-        <w:t xml:space="preserve"> Aunque la inflación aprieta, la gente está dispuesta a invertir en salud y en reducir su huella de carbono si eso les ahorra dinero a futuro.</w:t>
-      </w:r>
-    </w:p>
-    <w:p>
-      <w:r>
-        <w:rPr>
-          <w:rFonts w:ascii="Manrope" w:hAnsi="Manrope"/>
-        </w:rPr>
-        <w:t xml:space="preserve">• </w:t>
-      </w:r>
-      <w:r>
-        <w:rPr>
-          <w:rFonts w:ascii="Manrope" w:hAnsi="Manrope"/>
-          <w:sz w:val="22"/>
-        </w:rPr>
-        <w:t xml:space="preserve">  </w:t>
-      </w:r>
-      <w:r>
-        <w:rPr>
-          <w:rFonts w:ascii="Manrope" w:hAnsi="Manrope"/>
-          <w:b/>
-          <w:sz w:val="22"/>
-        </w:rPr>
-        <w:t>Social:</w:t>
-      </w:r>
-      <w:r>
-        <w:rPr>
-          <w:rFonts w:ascii="Manrope" w:hAnsi="Manrope"/>
-          <w:sz w:val="22"/>
-        </w:rPr>
-        <w:t xml:space="preserve"> Hay un hambre real (y nunca mejor dicho) de productos "kilómetro cero" y de reconectar con lo natural.</w:t>
-      </w:r>
-    </w:p>
-    <w:p>
-      <w:pPr>
-        <w:rPr>
-          <w:rFonts w:ascii="Manrope" w:hAnsi="Manrope"/>
-          <w:sz w:val="22"/>
-        </w:rPr>
-      </w:pPr>
-      <w:r>
-        <w:rPr>
-          <w:rFonts w:ascii="Manrope" w:hAnsi="Manrope"/>
-        </w:rPr>
-        <w:t xml:space="preserve">• </w:t>
-      </w:r>
-      <w:r>
-        <w:rPr>
-          <w:rFonts w:ascii="Manrope" w:hAnsi="Manrope"/>
-          <w:sz w:val="22"/>
-        </w:rPr>
-        <w:t xml:space="preserve">  </w:t>
-      </w:r>
-      <w:r>
-        <w:rPr>
-          <w:rFonts w:ascii="Manrope" w:hAnsi="Manrope"/>
-          <w:b/>
-          <w:sz w:val="22"/>
-        </w:rPr>
-        <w:t>Tecnológico:</w:t>
-      </w:r>
-      <w:r>
-        <w:rPr>
-          <w:rFonts w:ascii="Manrope" w:hAnsi="Manrope"/>
-          <w:sz w:val="22"/>
-        </w:rPr>
-        <w:t xml:space="preserve"> El avance del IoT y la IA nos permite democratizar técnicas que antes eran solo para profesionales.</w:t>
-      </w:r>
-    </w:p>
-    <w:p>
-      <w:pPr>
-        <w:rPr>
-          <w:rFonts w:ascii="Manrope" w:hAnsi="Manrope"/>
-          <w:sz w:val="22"/>
-        </w:rPr>
-      </w:pPr>
-    </w:p>
-    <w:p>
-      <w:pPr>
-        <w:rPr>
-          <w:rFonts w:ascii="Manrope" w:hAnsi="Manrope"/>
-          <w:sz w:val="22"/>
-        </w:rPr>
-      </w:pPr>
-    </w:p>
-    <w:p>
-      <w:pPr>
-        <w:rPr>
-          <w:rFonts w:ascii="Manrope" w:hAnsi="Manrope"/>
-          <w:sz w:val="22"/>
-        </w:rPr>
-      </w:pPr>
-    </w:p>
-    <w:p/>
-    <w:p>
-      <w:r>
-        <w:rPr>
-          <w:rFonts w:ascii="Manrope" w:hAnsi="Manrope"/>
-          <w:b/>
-          <w:color w:val="003594"/>
-          <w:sz w:val="28"/>
-        </w:rPr>
-        <w:lastRenderedPageBreak/>
-        <w:t>Matriz DAFO (Realidad sin filtros)</w:t>
+        <w:t>.</w:t>
       </w:r>
     </w:p>
     <w:tbl>
@@ -1461,6 +1780,9 @@
             <w:tcW w:w="4673" w:type="dxa"/>
           </w:tcPr>
           <w:p>
+            <w:pPr>
+              <w:jc w:val="center"/>
+            </w:pPr>
             <w:r>
               <w:rPr>
                 <w:rFonts w:ascii="Manrope" w:hAnsi="Manrope"/>
@@ -1477,6 +1799,9 @@
             <w:tcW w:w="5545" w:type="dxa"/>
           </w:tcPr>
           <w:p>
+            <w:pPr>
+              <w:jc w:val="center"/>
+            </w:pPr>
             <w:r>
               <w:rPr>
                 <w:rFonts w:ascii="Manrope" w:hAnsi="Manrope"/>
@@ -1508,7 +1833,25 @@
                 <w:bCs/>
                 <w:sz w:val="22"/>
               </w:rPr>
-              <w:t>Tecnología fácil de usar (Plug &amp; Grow).</w:t>
+              <w:t xml:space="preserve">Tecnología fácil de usar (Plug &amp; </w:t>
+            </w:r>
+            <w:proofErr w:type="spellStart"/>
+            <w:r>
+              <w:rPr>
+                <w:rFonts w:ascii="Manrope" w:hAnsi="Manrope"/>
+                <w:bCs/>
+                <w:sz w:val="22"/>
+              </w:rPr>
+              <w:t>Grow</w:t>
+            </w:r>
+            <w:proofErr w:type="spellEnd"/>
+            <w:r>
+              <w:rPr>
+                <w:rFonts w:ascii="Manrope" w:hAnsi="Manrope"/>
+                <w:bCs/>
+                <w:sz w:val="22"/>
+              </w:rPr>
+              <w:t>).</w:t>
             </w:r>
           </w:p>
         </w:tc>
@@ -1589,18 +1932,20 @@
           <w:p>
             <w:pPr>
               <w:ind w:firstLine="0"/>
-              <w:jc w:val="left"/>
+              <w:jc w:val="center"/>
               <w:rPr>
-                <w:bCs/>
+                <w:b/>
+                <w:color w:val="365F91" w:themeColor="accent1" w:themeShade="BF"/>
               </w:rPr>
             </w:pPr>
             <w:r>
               <w:rPr>
                 <w:rFonts w:ascii="Manrope" w:hAnsi="Manrope"/>
-                <w:bCs/>
+                <w:b/>
+                <w:color w:val="365F91" w:themeColor="accent1" w:themeShade="BF"/>
                 <w:sz w:val="22"/>
               </w:rPr>
-              <w:t>Oportunidades</w:t>
+              <w:t>OPORTUNIDADES</w:t>
             </w:r>
           </w:p>
         </w:tc>
@@ -1611,18 +1956,20 @@
           <w:p>
             <w:pPr>
               <w:ind w:firstLine="0"/>
-              <w:jc w:val="left"/>
+              <w:jc w:val="center"/>
               <w:rPr>
-                <w:bCs/>
+                <w:b/>
+                <w:color w:val="365F91" w:themeColor="accent1" w:themeShade="BF"/>
               </w:rPr>
             </w:pPr>
             <w:r>
               <w:rPr>
                 <w:rFonts w:ascii="Manrope" w:hAnsi="Manrope"/>
-                <w:bCs/>
+                <w:b/>
+                <w:color w:val="365F91" w:themeColor="accent1" w:themeShade="BF"/>
                 <w:sz w:val="22"/>
               </w:rPr>
-              <w:t>Amenazas</w:t>
+              <w:t>AMENAZAS</w:t>
             </w:r>
           </w:p>
         </w:tc>
@@ -1734,7 +2081,7 @@
           <w:color w:val="003594"/>
           <w:sz w:val="36"/>
         </w:rPr>
-        <w:t xml:space="preserve">5. Forma </w:t>
+        <w:br/>
       </w:r>
       <w:r>
         <w:rPr>
@@ -1743,7 +2090,7 @@
           <w:color w:val="003594"/>
           <w:sz w:val="36"/>
         </w:rPr>
-        <w:t>j</w:t>
+        <w:t xml:space="preserve">5. Forma </w:t>
       </w:r>
       <w:r>
         <w:rPr>
@@ -1752,129 +2099,8 @@
           <w:color w:val="003594"/>
           <w:sz w:val="36"/>
         </w:rPr>
-        <w:t>urídica: ¿Cómo nos constituimos?</w:t>
-      </w:r>
-    </w:p>
-    <w:p>
-      <w:r>
-        <w:rPr>
-          <w:rFonts w:ascii="Manrope" w:hAnsi="Manrope"/>
-          <w:sz w:val="22"/>
-        </w:rPr>
-        <w:t xml:space="preserve">Después de darle muchas vueltas, la verdad es que la opción más sensata para Murgi SL es constituirnos como una </w:t>
-      </w:r>
-      <w:r>
-        <w:rPr>
-          <w:rFonts w:ascii="Manrope" w:hAnsi="Manrope"/>
-          <w:b/>
-          <w:sz w:val="22"/>
-        </w:rPr>
-        <w:t>Sociedad de Responsabilidad Limitada (S.L.)</w:t>
-      </w:r>
-      <w:r>
-        <w:rPr>
-          <w:rFonts w:ascii="Manrope" w:hAnsi="Manrope"/>
-          <w:sz w:val="22"/>
-        </w:rPr>
-        <w:t>.</w:t>
-      </w:r>
-    </w:p>
-    <w:p>
-      <w:r>
-        <w:rPr>
-          <w:rFonts w:ascii="Manrope" w:hAnsi="Manrope"/>
-          <w:sz w:val="22"/>
-        </w:rPr>
-        <w:t>¿Por qué? Pues mira, principalmente por tres motivos que nos dan mucha paz mental:</w:t>
-      </w:r>
-    </w:p>
-    <w:p>
-      <w:r>
-        <w:rPr>
-          <w:rFonts w:ascii="Manrope" w:hAnsi="Manrope"/>
-          <w:sz w:val="22"/>
-        </w:rPr>
-        <w:t xml:space="preserve">1.  </w:t>
-      </w:r>
-      <w:r>
-        <w:rPr>
-          <w:rFonts w:ascii="Manrope" w:hAnsi="Manrope"/>
-          <w:b/>
-          <w:sz w:val="22"/>
-        </w:rPr>
-        <w:t>Protección personal:</w:t>
-      </w:r>
-      <w:r>
-        <w:rPr>
-          <w:rFonts w:ascii="Manrope" w:hAnsi="Manrope"/>
-          <w:sz w:val="22"/>
-        </w:rPr>
-        <w:t xml:space="preserve"> Al ser una S.L., nuestra responsabilidad se limita al capital que aportamos. Si las cosas se ponen feas empresarialmente hablando, nuestro patrimonio personal está a salvo.</w:t>
-      </w:r>
-    </w:p>
-    <w:p>
-      <w:r>
-        <w:rPr>
-          <w:rFonts w:ascii="Manrope" w:hAnsi="Manrope"/>
-          <w:sz w:val="22"/>
-        </w:rPr>
-        <w:t xml:space="preserve">2.  </w:t>
-      </w:r>
-      <w:r>
-        <w:rPr>
-          <w:rFonts w:ascii="Manrope" w:hAnsi="Manrope"/>
-          <w:b/>
-          <w:sz w:val="22"/>
-        </w:rPr>
-        <w:t>Imagen y seriedad:</w:t>
-      </w:r>
-      <w:r>
-        <w:rPr>
-          <w:rFonts w:ascii="Manrope" w:hAnsi="Manrope"/>
-          <w:sz w:val="22"/>
-        </w:rPr>
-        <w:t xml:space="preserve"> Para atraer inversores o socios tecnológicos, una S.L. proyecta una imagen de robustez que una comunidad de bienes o ser autónomo no siempre consigue.</w:t>
-      </w:r>
-    </w:p>
-    <w:p>
-      <w:r>
-        <w:rPr>
-          <w:rFonts w:ascii="Manrope" w:hAnsi="Manrope"/>
-          <w:sz w:val="22"/>
-        </w:rPr>
-        <w:t xml:space="preserve">3.  </w:t>
-      </w:r>
-      <w:r>
-        <w:rPr>
-          <w:rFonts w:ascii="Manrope" w:hAnsi="Manrope"/>
-          <w:b/>
-          <w:sz w:val="22"/>
-        </w:rPr>
-        <w:t>Flexibilidad y crecimiento:</w:t>
-      </w:r>
-      <w:r>
-        <w:rPr>
-          <w:rFonts w:ascii="Manrope" w:hAnsi="Manrope"/>
-          <w:sz w:val="22"/>
-        </w:rPr>
-        <w:t xml:space="preserve"> Es una estructura que nos permite crecer, añadir socios o incluso pivotar el modelo de negocio con relativa facilidad administrativa.</w:t>
-      </w:r>
-    </w:p>
-    <w:p>
-      <w:r>
-        <w:rPr>
-          <w:rFonts w:ascii="Manrope" w:hAnsi="Manrope"/>
-          <w:sz w:val="22"/>
-        </w:rPr>
-        <w:t>Empezaremos con el capital mínimo legal, pero con la vista puesta en reinvertir todos los beneficios de los primeros 18 meses en mejorar nuestra tecnología IoT.</w:t>
-      </w:r>
-    </w:p>
-    <w:p>
-      <w:r>
-        <w:br w:type="page"/>
-      </w:r>
-    </w:p>
-    <w:p>
+        <w:t>j</w:t>
+      </w:r>
       <w:r>
         <w:rPr>
           <w:rFonts w:ascii="Manrope" w:hAnsi="Manrope"/>
@@ -1882,41 +2108,265 @@
           <w:color w:val="003594"/>
           <w:sz w:val="36"/>
         </w:rPr>
-        <w:lastRenderedPageBreak/>
-        <w:t>6. Conclusión</w:t>
-      </w:r>
-    </w:p>
-    <w:p>
-      <w:r>
-        <w:rPr>
-          <w:rFonts w:ascii="Manrope" w:hAnsi="Manrope"/>
-          <w:sz w:val="22"/>
-        </w:rPr>
-        <w:t>Si te soy sincero, esto de Murgi SL me tiene muy ilusionado. No es solo un proyecto de empresa; es nuestra forma de decir que el futuro de las ciudades puede ser un poquito más humano y un mucho más verde. Sabemos que el reto tecnológico es grande y que competir con los hábitos de consumo actuales no es moco de pavo, pero la respuesta que estamos viendo en la calle nos dice que vamos por el buen camino.</w:t>
-      </w:r>
-    </w:p>
-    <w:p>
-      <w:r>
-        <w:rPr>
-          <w:rFonts w:ascii="Manrope" w:hAnsi="Manrope"/>
-          <w:sz w:val="22"/>
-        </w:rPr>
-        <w:t>Queremos que el día de mañana, entrar en un piso de Madrid o Barcelona y ver una cascada de verdes vivos en una pared del salón sea lo normal. Al final, no estamos vendiendo hardware, estamos vendiendo la oportunidad de volver a ensuciarnos las manos (aunque sea digitalmente) y comer algo que hemos visto crecer desde la semilla. ¡Nos vemos en el huerto!</w:t>
-      </w:r>
-    </w:p>
-    <w:p>
-      <w:r>
-        <w:br w:type="page"/>
-      </w:r>
-    </w:p>
-    <w:p>
-      <w:r>
+        <w:t>urídica: ¿Cómo nos constituimos?</w:t>
+      </w:r>
+    </w:p>
+    <w:p>
+      <w:r>
+        <w:rPr>
+          <w:rFonts w:ascii="Manrope" w:hAnsi="Manrope"/>
+        </w:rPr>
+        <w:t xml:space="preserve">Después de darle muchas vueltas, la verdad es que la opción más sensata para </w:t>
+      </w:r>
+      <w:proofErr w:type="spellStart"/>
+      <w:r>
+        <w:rPr>
+          <w:rFonts w:ascii="Manrope" w:hAnsi="Manrope"/>
+        </w:rPr>
+        <w:t>Murgi</w:t>
+      </w:r>
+      <w:proofErr w:type="spellEnd"/>
+      <w:r>
+        <w:rPr>
+          <w:rFonts w:ascii="Manrope" w:hAnsi="Manrope"/>
+        </w:rPr>
+        <w:t xml:space="preserve"> SL es constituirnos como una </w:t>
+      </w:r>
+      <w:r>
+        <w:rPr>
+          <w:rFonts w:ascii="Manrope" w:hAnsi="Manrope"/>
+          <w:b/>
+        </w:rPr>
+        <w:t>Sociedad de Responsabilidad Limitada (S.L.)</w:t>
+      </w:r>
+      <w:r>
+        <w:rPr>
+          <w:rFonts w:ascii="Manrope" w:hAnsi="Manrope"/>
+        </w:rPr>
+        <w:t>.</w:t>
+      </w:r>
+    </w:p>
+    <w:p>
+      <w:r>
+        <w:rPr>
+          <w:rFonts w:ascii="Manrope" w:hAnsi="Manrope"/>
+        </w:rPr>
+        <w:t>¿Por qué? Pues mira, principalmente por tres motivos que nos dan mucha paz mental:</w:t>
+      </w:r>
+    </w:p>
+    <w:p>
+      <w:pPr>
+        <w:pStyle w:val="Prrafodelista"/>
+        <w:numPr>
+          <w:ilvl w:val="0"/>
+          <w:numId w:val="5"/>
+        </w:numPr>
+        <w:jc w:val="left"/>
+      </w:pPr>
+      <w:r>
+        <w:rPr>
+          <w:rFonts w:ascii="Manrope" w:hAnsi="Manrope"/>
+          <w:b/>
+        </w:rPr>
+        <w:t>Protección personal:</w:t>
+      </w:r>
+      <w:r>
+        <w:rPr>
+          <w:rFonts w:ascii="Manrope" w:hAnsi="Manrope"/>
+        </w:rPr>
+        <w:t xml:space="preserve"> Al ser una S.L., nuestra responsabilidad se limita al capital que aportamos. Si las cosas se ponen feas empresarialmente hablando, nuestro patrimonio personal está a salvo.</w:t>
+      </w:r>
+      <w:r>
+        <w:rPr>
+          <w:rFonts w:ascii="Manrope" w:hAnsi="Manrope"/>
+        </w:rPr>
+        <w:br/>
+      </w:r>
+    </w:p>
+    <w:p>
+      <w:pPr>
+        <w:pStyle w:val="Prrafodelista"/>
+        <w:numPr>
+          <w:ilvl w:val="0"/>
+          <w:numId w:val="5"/>
+        </w:numPr>
+        <w:jc w:val="left"/>
+      </w:pPr>
+      <w:r>
+        <w:rPr>
+          <w:rFonts w:ascii="Manrope" w:hAnsi="Manrope"/>
+          <w:b/>
+        </w:rPr>
+        <w:t>Imagen y seriedad:</w:t>
+      </w:r>
+      <w:r>
+        <w:rPr>
+          <w:rFonts w:ascii="Manrope" w:hAnsi="Manrope"/>
+        </w:rPr>
+        <w:t xml:space="preserve"> Para atraer inversores o socios tecnológicos, una S.L. proyecta una imagen de robustez que una comunidad de bienes o ser autónomo no siempre consigue.</w:t>
+      </w:r>
+      <w:r>
+        <w:rPr>
+          <w:rFonts w:ascii="Manrope" w:hAnsi="Manrope"/>
+        </w:rPr>
+        <w:br/>
+      </w:r>
+    </w:p>
+    <w:p>
+      <w:pPr>
+        <w:pStyle w:val="Prrafodelista"/>
+        <w:numPr>
+          <w:ilvl w:val="0"/>
+          <w:numId w:val="5"/>
+        </w:numPr>
+        <w:jc w:val="left"/>
+      </w:pPr>
+      <w:r>
+        <w:rPr>
+          <w:rFonts w:ascii="Manrope" w:hAnsi="Manrope"/>
+          <w:b/>
+        </w:rPr>
+        <w:t>Flexibilidad y crecimiento:</w:t>
+      </w:r>
+      <w:r>
+        <w:rPr>
+          <w:rFonts w:ascii="Manrope" w:hAnsi="Manrope"/>
+        </w:rPr>
+        <w:t xml:space="preserve"> Es una estructura que nos permite crecer, añadir socios o incluso pivotar el modelo de negocio con relativa facilidad administrativa.</w:t>
+      </w:r>
+    </w:p>
+    <w:p>
+      <w:pPr>
+        <w:jc w:val="left"/>
+      </w:pPr>
+      <w:r>
+        <w:rPr>
+          <w:rFonts w:ascii="Manrope" w:hAnsi="Manrope"/>
+        </w:rPr>
+        <w:t xml:space="preserve">Empezaremos con el capital mínimo legal, pero con la vista puesta en reinvertir todos los beneficios de los primeros 18 meses en mejorar nuestra tecnología </w:t>
+      </w:r>
+      <w:proofErr w:type="spellStart"/>
+      <w:r>
+        <w:rPr>
+          <w:rFonts w:ascii="Manrope" w:hAnsi="Manrope"/>
+        </w:rPr>
+        <w:t>IoT</w:t>
+      </w:r>
+      <w:proofErr w:type="spellEnd"/>
+      <w:r>
+        <w:rPr>
+          <w:rFonts w:ascii="Manrope" w:hAnsi="Manrope"/>
+        </w:rPr>
+        <w:t>.</w:t>
+      </w:r>
+      <w:r>
+        <w:rPr>
+          <w:rFonts w:ascii="Manrope" w:hAnsi="Manrope"/>
+        </w:rPr>
+        <w:br/>
+      </w:r>
+      <w:r>
+        <w:rPr>
+          <w:rFonts w:ascii="Manrope" w:hAnsi="Manrope"/>
+          <w:sz w:val="22"/>
+        </w:rPr>
+        <w:br/>
+      </w:r>
+    </w:p>
+    <w:p>
+      <w:pPr>
         <w:rPr>
           <w:rFonts w:ascii="Manrope" w:hAnsi="Manrope"/>
           <w:b/>
           <w:color w:val="003594"/>
           <w:sz w:val="36"/>
         </w:rPr>
+      </w:pPr>
+    </w:p>
+    <w:p>
+      <w:r>
+        <w:rPr>
+          <w:rFonts w:ascii="Manrope" w:hAnsi="Manrope"/>
+          <w:b/>
+          <w:color w:val="003594"/>
+          <w:sz w:val="36"/>
+        </w:rPr>
+        <w:t>6. Conclusión</w:t>
+      </w:r>
+    </w:p>
+    <w:p>
+      <w:pPr>
+        <w:jc w:val="left"/>
+      </w:pPr>
+      <w:proofErr w:type="spellStart"/>
+      <w:r>
+        <w:rPr>
+          <w:rFonts w:ascii="Manrope" w:hAnsi="Manrope"/>
+        </w:rPr>
+        <w:t>Murgi</w:t>
+      </w:r>
+      <w:proofErr w:type="spellEnd"/>
+      <w:r>
+        <w:rPr>
+          <w:rFonts w:ascii="Manrope" w:hAnsi="Manrope"/>
+        </w:rPr>
+        <w:t xml:space="preserve"> SL me tiene muy ilusionado. No es solo un proyecto de empresa</w:t>
+      </w:r>
+      <w:r>
+        <w:rPr>
+          <w:rFonts w:ascii="Manrope" w:hAnsi="Manrope"/>
+        </w:rPr>
+        <w:t>,</w:t>
+      </w:r>
+      <w:r>
+        <w:rPr>
+          <w:rFonts w:ascii="Manrope" w:hAnsi="Manrope"/>
+        </w:rPr>
+        <w:t xml:space="preserve"> es nuestra forma de decir que el futuro de las ciudades puede ser un poquito más humano y un mucho más verde. Sabemos que el reto tecnológico es grande y que competir con los hábitos de consumo actuales no es moco de pavo, pero la respuesta que estamos viendo en la calle nos dice que vamos por el buen camino.</w:t>
+      </w:r>
+    </w:p>
+    <w:p>
+      <w:pPr>
+        <w:jc w:val="left"/>
+      </w:pPr>
+      <w:r>
+        <w:rPr>
+          <w:rFonts w:ascii="Manrope" w:hAnsi="Manrope"/>
+        </w:rPr>
+        <w:t xml:space="preserve">Queremos que el día de mañana, entrar en un piso de Madrid o Barcelona y ver una cascada de verdes vivos en una pared del salón sea lo normal. Al final, no estamos vendiendo hardware, estamos vendiendo la oportunidad de volver a ensuciarnos las manos (aunque sea digitalmente) y comer algo que hemos visto crecer desde la semilla. </w:t>
+      </w:r>
+      <w:r>
+        <w:rPr>
+          <w:rFonts w:ascii="Manrope" w:hAnsi="Manrope"/>
+        </w:rPr>
+        <w:br/>
+      </w:r>
+      <w:r>
+        <w:rPr>
+          <w:rFonts w:ascii="Manrope" w:hAnsi="Manrope"/>
+        </w:rPr>
+        <w:br/>
+      </w:r>
+      <w:r>
+        <w:rPr>
+          <w:rFonts w:ascii="Manrope" w:hAnsi="Manrope"/>
+        </w:rPr>
+        <w:t>¡Nos vemos en el huerto!</w:t>
+      </w:r>
+    </w:p>
+    <w:p>
+      <w:r>
+        <w:br w:type="page"/>
+      </w:r>
+    </w:p>
+    <w:p>
+      <w:r>
+        <w:rPr>
+          <w:rFonts w:ascii="Manrope" w:hAnsi="Manrope"/>
+          <w:b/>
+          <w:color w:val="003594"/>
+          <w:sz w:val="36"/>
+        </w:rPr>
         <w:lastRenderedPageBreak/>
         <w:t xml:space="preserve">7. Bibliografía y </w:t>
       </w:r>
@@ -2028,14 +2478,50 @@
           <w:b/>
           <w:sz w:val="22"/>
         </w:rPr>
-        <w:t>Recursos internos de Murgi SL: Prototipos de diseño UI/UX y arquitectura IoT.</w:t>
+        <w:t xml:space="preserve">Recursos internos de </w:t>
+      </w:r>
+      <w:proofErr w:type="spellStart"/>
+      <w:r>
+        <w:rPr>
+          <w:rFonts w:ascii="Manrope" w:hAnsi="Manrope"/>
+          <w:b/>
+          <w:sz w:val="22"/>
+        </w:rPr>
+        <w:t>Murgi</w:t>
+      </w:r>
+      <w:proofErr w:type="spellEnd"/>
+      <w:r>
+        <w:rPr>
+          <w:rFonts w:ascii="Manrope" w:hAnsi="Manrope"/>
+          <w:b/>
+          <w:sz w:val="22"/>
+        </w:rPr>
+        <w:t xml:space="preserve"> SL: Prototipos de diseño UI/UX y arquitectura </w:t>
+      </w:r>
+      <w:proofErr w:type="spellStart"/>
+      <w:r>
+        <w:rPr>
+          <w:rFonts w:ascii="Manrope" w:hAnsi="Manrope"/>
+          <w:b/>
+          <w:sz w:val="22"/>
+        </w:rPr>
+        <w:t>IoT</w:t>
+      </w:r>
+      <w:proofErr w:type="spellEnd"/>
+      <w:r>
+        <w:rPr>
+          <w:rFonts w:ascii="Manrope" w:hAnsi="Manrope"/>
+          <w:b/>
+          <w:sz w:val="22"/>
+        </w:rPr>
+        <w:t>.</w:t>
       </w:r>
     </w:p>
     <w:sectPr>
-      <w:headerReference w:type="default" r:id="rId7"/>
-      <w:footerReference w:type="even" r:id="rId8"/>
-      <w:footerReference w:type="default" r:id="rId9"/>
-      <w:headerReference w:type="first" r:id="rId10"/>
+      <w:headerReference w:type="default" r:id="rId8"/>
+      <w:footerReference w:type="even" r:id="rId9"/>
+      <w:footerReference w:type="default" r:id="rId10"/>
+      <w:headerReference w:type="first" r:id="rId11"/>
       <w:pgSz w:w="11906" w:h="16838"/>
       <w:pgMar w:top="595" w:right="839" w:bottom="595" w:left="839" w:header="1134" w:footer="1134" w:gutter="0"/>
       <w:pgNumType w:start="0"/>
@@ -2445,6 +2931,832 @@
     </w:r>
   </w:p>
 </w:hdr>
+</file>
+
+<file path=word/numbering.xml><?xml version="1.0" encoding="utf-8"?>
+<w:numbering xmlns:wpc="http://schemas.microsoft.com/office/word/2010/wordprocessingCanvas" xmlns:cx="http://schemas.microsoft.com/office/drawing/2014/chartex" xmlns:cx1="http://schemas.microsoft.com/office/drawing/2015/9/8/chartex" xmlns:cx2="http://schemas.microsoft.com/office/drawing/2015/10/21/chartex" xmlns:cx3="http://schemas.microsoft.com/office/drawing/2016/5/9/chartex" xmlns:cx4="http://schemas.microsoft.com/office/drawing/2016/5/10/chartex" xmlns:cx5="http://schemas.microsoft.com/office/drawing/2016/5/11/chartex" xmlns:cx6="http://schemas.microsoft.com/office/drawing/2016/5/12/chartex" xmlns:cx7="http://schemas.microsoft.com/office/drawing/2016/5/13/chartex" xmlns:cx8="http://schemas.microsoft.com/office/drawing/2016/5/14/chartex" xmlns:mc="http://schemas.openxmlformats.org/markup-compatibility/2006" xmlns:aink="http://schemas.microsoft.com/office/drawing/2016/ink" xmlns:am3d="http://schemas.microsoft.com/office/drawing/2017/model3d" xmlns:o="urn:schemas-microsoft-com:office:office" xmlns:oel="http://schemas.microsoft.com/office/2019/extlst" xmlns:r="http://schemas.openxmlformats.org/officeDocument/2006/relationships" xmlns:m="http://schemas.openxmlformats.org/officeDocument/2006/math" xmlns:v="urn:schemas-microsoft-com:vml" xmlns:wp14="http://schemas.microsoft.com/office/word/2010/wordprocessingDrawing" xmlns:wp="http://schemas.openxmlformats.org/drawingml/2006/wordprocessingDrawing" xmlns:w10="urn:schemas-microsoft-com:office:word" xmlns:w="http://schemas.openxmlformats.org/wordprocessingml/2006/main" xmlns:w14="http://schemas.microsoft.com/office/word/2010/wordml" xmlns:w15="http://schemas.microsoft.com/office/word/2012/wordml" xmlns:w16cex="http://schemas.microsoft.com/office/word/2018/wordml/cex" xmlns:w16cid="http://schemas.microsoft.com/office/word/2016/wordml/cid" xmlns:w16="http://schemas.microsoft.com/office/word/2018/wordml" xmlns:w16sdtdh="http://schemas.microsoft.com/office/word/2020/wordml/sdtdatahash" xmlns:w16se="http://schemas.microsoft.com/office/word/2015/wordml/symex" xmlns:wpg="http://schemas.microsoft.com/office/word/2010/wordprocessingGroup" xmlns:wpi="http://schemas.microsoft.com/office/word/2010/wordprocessingInk" xmlns:wne="http://schemas.microsoft.com/office/word/2006/wordml" xmlns:wps="http://schemas.microsoft.com/office/word/2010/wordprocessingShape" mc:Ignorable="w14 w15 w16se w16cid w16 w16cex w16sdtdh wp14">
+  <w:abstractNum w:abstractNumId="0" w15:restartNumberingAfterBreak="0">
+    <w:nsid w:val="09BA5341"/>
+    <w:multiLevelType w:val="hybridMultilevel"/>
+    <w:tmpl w:val="3B942B78"/>
+    <w:lvl w:ilvl="0" w:tplc="34921D3E">
+      <w:numFmt w:val="bullet"/>
+      <w:lvlText w:val="•"/>
+      <w:lvlJc w:val="left"/>
+      <w:pPr>
+        <w:ind w:left="1040" w:hanging="360"/>
+      </w:pPr>
+      <w:rPr>
+        <w:rFonts w:ascii="Manrope" w:eastAsia="Aptos" w:hAnsi="Manrope" w:cs="Aptos" w:hint="default"/>
+      </w:rPr>
+    </w:lvl>
+    <w:lvl w:ilvl="1" w:tplc="0C0A0003" w:tentative="1">
+      <w:start w:val="1"/>
+      <w:numFmt w:val="bullet"/>
+      <w:lvlText w:val="o"/>
+      <w:lvlJc w:val="left"/>
+      <w:pPr>
+        <w:ind w:left="1780" w:hanging="360"/>
+      </w:pPr>
+      <w:rPr>
+        <w:rFonts w:ascii="Courier New" w:hAnsi="Courier New" w:cs="Courier New" w:hint="default"/>
+      </w:rPr>
+    </w:lvl>
+    <w:lvl w:ilvl="2" w:tplc="0C0A0005" w:tentative="1">
+      <w:start w:val="1"/>
+      <w:numFmt w:val="bullet"/>
+      <w:lvlText w:val=""/>
+      <w:lvlJc w:val="left"/>
+      <w:pPr>
+        <w:ind w:left="2500" w:hanging="360"/>
+      </w:pPr>
+      <w:rPr>
+        <w:rFonts w:ascii="Wingdings" w:hAnsi="Wingdings" w:hint="default"/>
+      </w:rPr>
+    </w:lvl>
+    <w:lvl w:ilvl="3" w:tplc="0C0A0001" w:tentative="1">
+      <w:start w:val="1"/>
+      <w:numFmt w:val="bullet"/>
+      <w:lvlText w:val=""/>
+      <w:lvlJc w:val="left"/>
+      <w:pPr>
+        <w:ind w:left="3220" w:hanging="360"/>
+      </w:pPr>
+      <w:rPr>
+        <w:rFonts w:ascii="Symbol" w:hAnsi="Symbol" w:hint="default"/>
+      </w:rPr>
+    </w:lvl>
+    <w:lvl w:ilvl="4" w:tplc="0C0A0003" w:tentative="1">
+      <w:start w:val="1"/>
+      <w:numFmt w:val="bullet"/>
+      <w:lvlText w:val="o"/>
+      <w:lvlJc w:val="left"/>
+      <w:pPr>
+        <w:ind w:left="3940" w:hanging="360"/>
+      </w:pPr>
+      <w:rPr>
+        <w:rFonts w:ascii="Courier New" w:hAnsi="Courier New" w:cs="Courier New" w:hint="default"/>
+      </w:rPr>
+    </w:lvl>
+    <w:lvl w:ilvl="5" w:tplc="0C0A0005" w:tentative="1">
+      <w:start w:val="1"/>
+      <w:numFmt w:val="bullet"/>
+      <w:lvlText w:val=""/>
+      <w:lvlJc w:val="left"/>
+      <w:pPr>
+        <w:ind w:left="4660" w:hanging="360"/>
+      </w:pPr>
+      <w:rPr>
+        <w:rFonts w:ascii="Wingdings" w:hAnsi="Wingdings" w:hint="default"/>
+      </w:rPr>
+    </w:lvl>
+    <w:lvl w:ilvl="6" w:tplc="0C0A0001" w:tentative="1">
+      <w:start w:val="1"/>
+      <w:numFmt w:val="bullet"/>
+      <w:lvlText w:val=""/>
+      <w:lvlJc w:val="left"/>
+      <w:pPr>
+        <w:ind w:left="5380" w:hanging="360"/>
+      </w:pPr>
+      <w:rPr>
+        <w:rFonts w:ascii="Symbol" w:hAnsi="Symbol" w:hint="default"/>
+      </w:rPr>
+    </w:lvl>
+    <w:lvl w:ilvl="7" w:tplc="0C0A0003" w:tentative="1">
+      <w:start w:val="1"/>
+      <w:numFmt w:val="bullet"/>
+      <w:lvlText w:val="o"/>
+      <w:lvlJc w:val="left"/>
+      <w:pPr>
+        <w:ind w:left="6100" w:hanging="360"/>
+      </w:pPr>
+      <w:rPr>
+        <w:rFonts w:ascii="Courier New" w:hAnsi="Courier New" w:cs="Courier New" w:hint="default"/>
+      </w:rPr>
+    </w:lvl>
+    <w:lvl w:ilvl="8" w:tplc="0C0A0005" w:tentative="1">
+      <w:start w:val="1"/>
+      <w:numFmt w:val="bullet"/>
+      <w:lvlText w:val=""/>
+      <w:lvlJc w:val="left"/>
+      <w:pPr>
+        <w:ind w:left="6820" w:hanging="360"/>
+      </w:pPr>
+      <w:rPr>
+        <w:rFonts w:ascii="Wingdings" w:hAnsi="Wingdings" w:hint="default"/>
+      </w:rPr>
+    </w:lvl>
+  </w:abstractNum>
+  <w:abstractNum w:abstractNumId="1" w15:restartNumberingAfterBreak="0">
+    <w:nsid w:val="206922A9"/>
+    <w:multiLevelType w:val="hybridMultilevel"/>
+    <w:tmpl w:val="54EC43E6"/>
+    <w:lvl w:ilvl="0" w:tplc="34921D3E">
+      <w:numFmt w:val="bullet"/>
+      <w:lvlText w:val="•"/>
+      <w:lvlJc w:val="left"/>
+      <w:pPr>
+        <w:ind w:left="700" w:hanging="360"/>
+      </w:pPr>
+      <w:rPr>
+        <w:rFonts w:ascii="Manrope" w:eastAsia="Aptos" w:hAnsi="Manrope" w:cs="Aptos" w:hint="default"/>
+      </w:rPr>
+    </w:lvl>
+    <w:lvl w:ilvl="1" w:tplc="0C0A0003" w:tentative="1">
+      <w:start w:val="1"/>
+      <w:numFmt w:val="bullet"/>
+      <w:lvlText w:val="o"/>
+      <w:lvlJc w:val="left"/>
+      <w:pPr>
+        <w:ind w:left="1420" w:hanging="360"/>
+      </w:pPr>
+      <w:rPr>
+        <w:rFonts w:ascii="Courier New" w:hAnsi="Courier New" w:cs="Courier New" w:hint="default"/>
+      </w:rPr>
+    </w:lvl>
+    <w:lvl w:ilvl="2" w:tplc="0C0A0005" w:tentative="1">
+      <w:start w:val="1"/>
+      <w:numFmt w:val="bullet"/>
+      <w:lvlText w:val=""/>
+      <w:lvlJc w:val="left"/>
+      <w:pPr>
+        <w:ind w:left="2140" w:hanging="360"/>
+      </w:pPr>
+      <w:rPr>
+        <w:rFonts w:ascii="Wingdings" w:hAnsi="Wingdings" w:hint="default"/>
+      </w:rPr>
+    </w:lvl>
+    <w:lvl w:ilvl="3" w:tplc="0C0A0001" w:tentative="1">
+      <w:start w:val="1"/>
+      <w:numFmt w:val="bullet"/>
+      <w:lvlText w:val=""/>
+      <w:lvlJc w:val="left"/>
+      <w:pPr>
+        <w:ind w:left="2860" w:hanging="360"/>
+      </w:pPr>
+      <w:rPr>
+        <w:rFonts w:ascii="Symbol" w:hAnsi="Symbol" w:hint="default"/>
+      </w:rPr>
+    </w:lvl>
+    <w:lvl w:ilvl="4" w:tplc="0C0A0003" w:tentative="1">
+      <w:start w:val="1"/>
+      <w:numFmt w:val="bullet"/>
+      <w:lvlText w:val="o"/>
+      <w:lvlJc w:val="left"/>
+      <w:pPr>
+        <w:ind w:left="3580" w:hanging="360"/>
+      </w:pPr>
+      <w:rPr>
+        <w:rFonts w:ascii="Courier New" w:hAnsi="Courier New" w:cs="Courier New" w:hint="default"/>
+      </w:rPr>
+    </w:lvl>
+    <w:lvl w:ilvl="5" w:tplc="0C0A0005" w:tentative="1">
+      <w:start w:val="1"/>
+      <w:numFmt w:val="bullet"/>
+      <w:lvlText w:val=""/>
+      <w:lvlJc w:val="left"/>
+      <w:pPr>
+        <w:ind w:left="4300" w:hanging="360"/>
+      </w:pPr>
+      <w:rPr>
+        <w:rFonts w:ascii="Wingdings" w:hAnsi="Wingdings" w:hint="default"/>
+      </w:rPr>
+    </w:lvl>
+    <w:lvl w:ilvl="6" w:tplc="0C0A0001" w:tentative="1">
+      <w:start w:val="1"/>
+      <w:numFmt w:val="bullet"/>
+      <w:lvlText w:val=""/>
+      <w:lvlJc w:val="left"/>
+      <w:pPr>
+        <w:ind w:left="5020" w:hanging="360"/>
+      </w:pPr>
+      <w:rPr>
+        <w:rFonts w:ascii="Symbol" w:hAnsi="Symbol" w:hint="default"/>
+      </w:rPr>
+    </w:lvl>
+    <w:lvl w:ilvl="7" w:tplc="0C0A0003" w:tentative="1">
+      <w:start w:val="1"/>
+      <w:numFmt w:val="bullet"/>
+      <w:lvlText w:val="o"/>
+      <w:lvlJc w:val="left"/>
+      <w:pPr>
+        <w:ind w:left="5740" w:hanging="360"/>
+      </w:pPr>
+      <w:rPr>
+        <w:rFonts w:ascii="Courier New" w:hAnsi="Courier New" w:cs="Courier New" w:hint="default"/>
+      </w:rPr>
+    </w:lvl>
+    <w:lvl w:ilvl="8" w:tplc="0C0A0005" w:tentative="1">
+      <w:start w:val="1"/>
+      <w:numFmt w:val="bullet"/>
+      <w:lvlText w:val=""/>
+      <w:lvlJc w:val="left"/>
+      <w:pPr>
+        <w:ind w:left="6460" w:hanging="360"/>
+      </w:pPr>
+      <w:rPr>
+        <w:rFonts w:ascii="Wingdings" w:hAnsi="Wingdings" w:hint="default"/>
+      </w:rPr>
+    </w:lvl>
+  </w:abstractNum>
+  <w:abstractNum w:abstractNumId="2" w15:restartNumberingAfterBreak="0">
+    <w:nsid w:val="2E5E110F"/>
+    <w:multiLevelType w:val="hybridMultilevel"/>
+    <w:tmpl w:val="39167604"/>
+    <w:lvl w:ilvl="0" w:tplc="34921D3E">
+      <w:numFmt w:val="bullet"/>
+      <w:lvlText w:val="•"/>
+      <w:lvlJc w:val="left"/>
+      <w:pPr>
+        <w:ind w:left="1040" w:hanging="360"/>
+      </w:pPr>
+      <w:rPr>
+        <w:rFonts w:ascii="Manrope" w:eastAsia="Aptos" w:hAnsi="Manrope" w:cs="Aptos" w:hint="default"/>
+      </w:rPr>
+    </w:lvl>
+    <w:lvl w:ilvl="1" w:tplc="0C0A0003" w:tentative="1">
+      <w:start w:val="1"/>
+      <w:numFmt w:val="bullet"/>
+      <w:lvlText w:val="o"/>
+      <w:lvlJc w:val="left"/>
+      <w:pPr>
+        <w:ind w:left="1780" w:hanging="360"/>
+      </w:pPr>
+      <w:rPr>
+        <w:rFonts w:ascii="Courier New" w:hAnsi="Courier New" w:cs="Courier New" w:hint="default"/>
+      </w:rPr>
+    </w:lvl>
+    <w:lvl w:ilvl="2" w:tplc="0C0A0005" w:tentative="1">
+      <w:start w:val="1"/>
+      <w:numFmt w:val="bullet"/>
+      <w:lvlText w:val=""/>
+      <w:lvlJc w:val="left"/>
+      <w:pPr>
+        <w:ind w:left="2500" w:hanging="360"/>
+      </w:pPr>
+      <w:rPr>
+        <w:rFonts w:ascii="Wingdings" w:hAnsi="Wingdings" w:hint="default"/>
+      </w:rPr>
+    </w:lvl>
+    <w:lvl w:ilvl="3" w:tplc="0C0A0001" w:tentative="1">
+      <w:start w:val="1"/>
+      <w:numFmt w:val="bullet"/>
+      <w:lvlText w:val=""/>
+      <w:lvlJc w:val="left"/>
+      <w:pPr>
+        <w:ind w:left="3220" w:hanging="360"/>
+      </w:pPr>
+      <w:rPr>
+        <w:rFonts w:ascii="Symbol" w:hAnsi="Symbol" w:hint="default"/>
+      </w:rPr>
+    </w:lvl>
+    <w:lvl w:ilvl="4" w:tplc="0C0A0003" w:tentative="1">
+      <w:start w:val="1"/>
+      <w:numFmt w:val="bullet"/>
+      <w:lvlText w:val="o"/>
+      <w:lvlJc w:val="left"/>
+      <w:pPr>
+        <w:ind w:left="3940" w:hanging="360"/>
+      </w:pPr>
+      <w:rPr>
+        <w:rFonts w:ascii="Courier New" w:hAnsi="Courier New" w:cs="Courier New" w:hint="default"/>
+      </w:rPr>
+    </w:lvl>
+    <w:lvl w:ilvl="5" w:tplc="0C0A0005" w:tentative="1">
+      <w:start w:val="1"/>
+      <w:numFmt w:val="bullet"/>
+      <w:lvlText w:val=""/>
+      <w:lvlJc w:val="left"/>
+      <w:pPr>
+        <w:ind w:left="4660" w:hanging="360"/>
+      </w:pPr>
+      <w:rPr>
+        <w:rFonts w:ascii="Wingdings" w:hAnsi="Wingdings" w:hint="default"/>
+      </w:rPr>
+    </w:lvl>
+    <w:lvl w:ilvl="6" w:tplc="0C0A0001" w:tentative="1">
+      <w:start w:val="1"/>
+      <w:numFmt w:val="bullet"/>
+      <w:lvlText w:val=""/>
+      <w:lvlJc w:val="left"/>
+      <w:pPr>
+        <w:ind w:left="5380" w:hanging="360"/>
+      </w:pPr>
+      <w:rPr>
+        <w:rFonts w:ascii="Symbol" w:hAnsi="Symbol" w:hint="default"/>
+      </w:rPr>
+    </w:lvl>
+    <w:lvl w:ilvl="7" w:tplc="0C0A0003" w:tentative="1">
+      <w:start w:val="1"/>
+      <w:numFmt w:val="bullet"/>
+      <w:lvlText w:val="o"/>
+      <w:lvlJc w:val="left"/>
+      <w:pPr>
+        <w:ind w:left="6100" w:hanging="360"/>
+      </w:pPr>
+      <w:rPr>
+        <w:rFonts w:ascii="Courier New" w:hAnsi="Courier New" w:cs="Courier New" w:hint="default"/>
+      </w:rPr>
+    </w:lvl>
+    <w:lvl w:ilvl="8" w:tplc="0C0A0005" w:tentative="1">
+      <w:start w:val="1"/>
+      <w:numFmt w:val="bullet"/>
+      <w:lvlText w:val=""/>
+      <w:lvlJc w:val="left"/>
+      <w:pPr>
+        <w:ind w:left="6820" w:hanging="360"/>
+      </w:pPr>
+      <w:rPr>
+        <w:rFonts w:ascii="Wingdings" w:hAnsi="Wingdings" w:hint="default"/>
+      </w:rPr>
+    </w:lvl>
+  </w:abstractNum>
+  <w:abstractNum w:abstractNumId="3" w15:restartNumberingAfterBreak="0">
+    <w:nsid w:val="4C5B7CE0"/>
+    <w:multiLevelType w:val="hybridMultilevel"/>
+    <w:tmpl w:val="F9D27D66"/>
+    <w:lvl w:ilvl="0" w:tplc="0C0A0001">
+      <w:start w:val="1"/>
+      <w:numFmt w:val="bullet"/>
+      <w:lvlText w:val=""/>
+      <w:lvlJc w:val="left"/>
+      <w:pPr>
+        <w:ind w:left="1060" w:hanging="360"/>
+      </w:pPr>
+      <w:rPr>
+        <w:rFonts w:ascii="Symbol" w:hAnsi="Symbol" w:hint="default"/>
+      </w:rPr>
+    </w:lvl>
+    <w:lvl w:ilvl="1" w:tplc="0C0A0003" w:tentative="1">
+      <w:start w:val="1"/>
+      <w:numFmt w:val="bullet"/>
+      <w:lvlText w:val="o"/>
+      <w:lvlJc w:val="left"/>
+      <w:pPr>
+        <w:ind w:left="1780" w:hanging="360"/>
+      </w:pPr>
+      <w:rPr>
+        <w:rFonts w:ascii="Courier New" w:hAnsi="Courier New" w:cs="Courier New" w:hint="default"/>
+      </w:rPr>
+    </w:lvl>
+    <w:lvl w:ilvl="2" w:tplc="0C0A0005" w:tentative="1">
+      <w:start w:val="1"/>
+      <w:numFmt w:val="bullet"/>
+      <w:lvlText w:val=""/>
+      <w:lvlJc w:val="left"/>
+      <w:pPr>
+        <w:ind w:left="2500" w:hanging="360"/>
+      </w:pPr>
+      <w:rPr>
+        <w:rFonts w:ascii="Wingdings" w:hAnsi="Wingdings" w:hint="default"/>
+      </w:rPr>
+    </w:lvl>
+    <w:lvl w:ilvl="3" w:tplc="0C0A0001" w:tentative="1">
+      <w:start w:val="1"/>
+      <w:numFmt w:val="bullet"/>
+      <w:lvlText w:val=""/>
+      <w:lvlJc w:val="left"/>
+      <w:pPr>
+        <w:ind w:left="3220" w:hanging="360"/>
+      </w:pPr>
+      <w:rPr>
+        <w:rFonts w:ascii="Symbol" w:hAnsi="Symbol" w:hint="default"/>
+      </w:rPr>
+    </w:lvl>
+    <w:lvl w:ilvl="4" w:tplc="0C0A0003" w:tentative="1">
+      <w:start w:val="1"/>
+      <w:numFmt w:val="bullet"/>
+      <w:lvlText w:val="o"/>
+      <w:lvlJc w:val="left"/>
+      <w:pPr>
+        <w:ind w:left="3940" w:hanging="360"/>
+      </w:pPr>
+      <w:rPr>
+        <w:rFonts w:ascii="Courier New" w:hAnsi="Courier New" w:cs="Courier New" w:hint="default"/>
+      </w:rPr>
+    </w:lvl>
+    <w:lvl w:ilvl="5" w:tplc="0C0A0005" w:tentative="1">
+      <w:start w:val="1"/>
+      <w:numFmt w:val="bullet"/>
+      <w:lvlText w:val=""/>
+      <w:lvlJc w:val="left"/>
+      <w:pPr>
+        <w:ind w:left="4660" w:hanging="360"/>
+      </w:pPr>
+      <w:rPr>
+        <w:rFonts w:ascii="Wingdings" w:hAnsi="Wingdings" w:hint="default"/>
+      </w:rPr>
+    </w:lvl>
+    <w:lvl w:ilvl="6" w:tplc="0C0A0001" w:tentative="1">
+      <w:start w:val="1"/>
+      <w:numFmt w:val="bullet"/>
+      <w:lvlText w:val=""/>
+      <w:lvlJc w:val="left"/>
+      <w:pPr>
+        <w:ind w:left="5380" w:hanging="360"/>
+      </w:pPr>
+      <w:rPr>
+        <w:rFonts w:ascii="Symbol" w:hAnsi="Symbol" w:hint="default"/>
+      </w:rPr>
+    </w:lvl>
+    <w:lvl w:ilvl="7" w:tplc="0C0A0003" w:tentative="1">
+      <w:start w:val="1"/>
+      <w:numFmt w:val="bullet"/>
+      <w:lvlText w:val="o"/>
+      <w:lvlJc w:val="left"/>
+      <w:pPr>
+        <w:ind w:left="6100" w:hanging="360"/>
+      </w:pPr>
+      <w:rPr>
+        <w:rFonts w:ascii="Courier New" w:hAnsi="Courier New" w:cs="Courier New" w:hint="default"/>
+      </w:rPr>
+    </w:lvl>
+    <w:lvl w:ilvl="8" w:tplc="0C0A0005" w:tentative="1">
+      <w:start w:val="1"/>
+      <w:numFmt w:val="bullet"/>
+      <w:lvlText w:val=""/>
+      <w:lvlJc w:val="left"/>
+      <w:pPr>
+        <w:ind w:left="6820" w:hanging="360"/>
+      </w:pPr>
+      <w:rPr>
+        <w:rFonts w:ascii="Wingdings" w:hAnsi="Wingdings" w:hint="default"/>
+      </w:rPr>
+    </w:lvl>
+  </w:abstractNum>
+  <w:abstractNum w:abstractNumId="4" w15:restartNumberingAfterBreak="0">
+    <w:nsid w:val="5E7C0A21"/>
+    <w:multiLevelType w:val="hybridMultilevel"/>
+    <w:tmpl w:val="6CC2D334"/>
+    <w:lvl w:ilvl="0" w:tplc="34921D3E">
+      <w:numFmt w:val="bullet"/>
+      <w:lvlText w:val="•"/>
+      <w:lvlJc w:val="left"/>
+      <w:pPr>
+        <w:ind w:left="1040" w:hanging="360"/>
+      </w:pPr>
+      <w:rPr>
+        <w:rFonts w:ascii="Manrope" w:eastAsia="Aptos" w:hAnsi="Manrope" w:cs="Aptos" w:hint="default"/>
+      </w:rPr>
+    </w:lvl>
+    <w:lvl w:ilvl="1" w:tplc="0C0A0003" w:tentative="1">
+      <w:start w:val="1"/>
+      <w:numFmt w:val="bullet"/>
+      <w:lvlText w:val="o"/>
+      <w:lvlJc w:val="left"/>
+      <w:pPr>
+        <w:ind w:left="1780" w:hanging="360"/>
+      </w:pPr>
+      <w:rPr>
+        <w:rFonts w:ascii="Courier New" w:hAnsi="Courier New" w:cs="Courier New" w:hint="default"/>
+      </w:rPr>
+    </w:lvl>
+    <w:lvl w:ilvl="2" w:tplc="0C0A0005" w:tentative="1">
+      <w:start w:val="1"/>
+      <w:numFmt w:val="bullet"/>
+      <w:lvlText w:val=""/>
+      <w:lvlJc w:val="left"/>
+      <w:pPr>
+        <w:ind w:left="2500" w:hanging="360"/>
+      </w:pPr>
+      <w:rPr>
+        <w:rFonts w:ascii="Wingdings" w:hAnsi="Wingdings" w:hint="default"/>
+      </w:rPr>
+    </w:lvl>
+    <w:lvl w:ilvl="3" w:tplc="0C0A0001" w:tentative="1">
+      <w:start w:val="1"/>
+      <w:numFmt w:val="bullet"/>
+      <w:lvlText w:val=""/>
+      <w:lvlJc w:val="left"/>
+      <w:pPr>
+        <w:ind w:left="3220" w:hanging="360"/>
+      </w:pPr>
+      <w:rPr>
+        <w:rFonts w:ascii="Symbol" w:hAnsi="Symbol" w:hint="default"/>
+      </w:rPr>
+    </w:lvl>
+    <w:lvl w:ilvl="4" w:tplc="0C0A0003" w:tentative="1">
+      <w:start w:val="1"/>
+      <w:numFmt w:val="bullet"/>
+      <w:lvlText w:val="o"/>
+      <w:lvlJc w:val="left"/>
+      <w:pPr>
+        <w:ind w:left="3940" w:hanging="360"/>
+      </w:pPr>
+      <w:rPr>
+        <w:rFonts w:ascii="Courier New" w:hAnsi="Courier New" w:cs="Courier New" w:hint="default"/>
+      </w:rPr>
+    </w:lvl>
+    <w:lvl w:ilvl="5" w:tplc="0C0A0005" w:tentative="1">
+      <w:start w:val="1"/>
+      <w:numFmt w:val="bullet"/>
+      <w:lvlText w:val=""/>
+      <w:lvlJc w:val="left"/>
+      <w:pPr>
+        <w:ind w:left="4660" w:hanging="360"/>
+      </w:pPr>
+      <w:rPr>
+        <w:rFonts w:ascii="Wingdings" w:hAnsi="Wingdings" w:hint="default"/>
+      </w:rPr>
+    </w:lvl>
+    <w:lvl w:ilvl="6" w:tplc="0C0A0001" w:tentative="1">
+      <w:start w:val="1"/>
+      <w:numFmt w:val="bullet"/>
+      <w:lvlText w:val=""/>
+      <w:lvlJc w:val="left"/>
+      <w:pPr>
+        <w:ind w:left="5380" w:hanging="360"/>
+      </w:pPr>
+      <w:rPr>
+        <w:rFonts w:ascii="Symbol" w:hAnsi="Symbol" w:hint="default"/>
+      </w:rPr>
+    </w:lvl>
+    <w:lvl w:ilvl="7" w:tplc="0C0A0003" w:tentative="1">
+      <w:start w:val="1"/>
+      <w:numFmt w:val="bullet"/>
+      <w:lvlText w:val="o"/>
+      <w:lvlJc w:val="left"/>
+      <w:pPr>
+        <w:ind w:left="6100" w:hanging="360"/>
+      </w:pPr>
+      <w:rPr>
+        <w:rFonts w:ascii="Courier New" w:hAnsi="Courier New" w:cs="Courier New" w:hint="default"/>
+      </w:rPr>
+    </w:lvl>
+    <w:lvl w:ilvl="8" w:tplc="0C0A0005" w:tentative="1">
+      <w:start w:val="1"/>
+      <w:numFmt w:val="bullet"/>
+      <w:lvlText w:val=""/>
+      <w:lvlJc w:val="left"/>
+      <w:pPr>
+        <w:ind w:left="6820" w:hanging="360"/>
+      </w:pPr>
+      <w:rPr>
+        <w:rFonts w:ascii="Wingdings" w:hAnsi="Wingdings" w:hint="default"/>
+      </w:rPr>
+    </w:lvl>
+  </w:abstractNum>
+  <w:abstractNum w:abstractNumId="5" w15:restartNumberingAfterBreak="0">
+    <w:nsid w:val="6FF00E89"/>
+    <w:multiLevelType w:val="multilevel"/>
+    <w:tmpl w:val="84ECB47E"/>
+    <w:lvl w:ilvl="0">
+      <w:start w:val="1"/>
+      <w:numFmt w:val="bullet"/>
+      <w:lvlText w:val=""/>
+      <w:lvlJc w:val="left"/>
+      <w:pPr>
+        <w:tabs>
+          <w:tab w:val="num" w:pos="720"/>
+        </w:tabs>
+        <w:ind w:left="720" w:hanging="360"/>
+      </w:pPr>
+      <w:rPr>
+        <w:rFonts w:ascii="Symbol" w:hAnsi="Symbol" w:hint="default"/>
+        <w:sz w:val="20"/>
+      </w:rPr>
+    </w:lvl>
+    <w:lvl w:ilvl="1" w:tentative="1">
+      <w:start w:val="1"/>
+      <w:numFmt w:val="bullet"/>
+      <w:lvlText w:val="o"/>
+      <w:lvlJc w:val="left"/>
+      <w:pPr>
+        <w:tabs>
+          <w:tab w:val="num" w:pos="1440"/>
+        </w:tabs>
+        <w:ind w:left="1440" w:hanging="360"/>
+      </w:pPr>
+      <w:rPr>
+        <w:rFonts w:ascii="Courier New" w:hAnsi="Courier New" w:hint="default"/>
+        <w:sz w:val="20"/>
+      </w:rPr>
+    </w:lvl>
+    <w:lvl w:ilvl="2" w:tentative="1">
+      <w:start w:val="1"/>
+      <w:numFmt w:val="bullet"/>
+      <w:lvlText w:val=""/>
+      <w:lvlJc w:val="left"/>
+      <w:pPr>
+        <w:tabs>
+          <w:tab w:val="num" w:pos="2160"/>
+        </w:tabs>
+        <w:ind w:left="2160" w:hanging="360"/>
+      </w:pPr>
+      <w:rPr>
+        <w:rFonts w:ascii="Wingdings" w:hAnsi="Wingdings" w:hint="default"/>
+        <w:sz w:val="20"/>
+      </w:rPr>
+    </w:lvl>
+    <w:lvl w:ilvl="3" w:tentative="1">
+      <w:start w:val="1"/>
+      <w:numFmt w:val="bullet"/>
+      <w:lvlText w:val=""/>
+      <w:lvlJc w:val="left"/>
+      <w:pPr>
+        <w:tabs>
+          <w:tab w:val="num" w:pos="2880"/>
+        </w:tabs>
+        <w:ind w:left="2880" w:hanging="360"/>
+      </w:pPr>
+      <w:rPr>
+        <w:rFonts w:ascii="Wingdings" w:hAnsi="Wingdings" w:hint="default"/>
+        <w:sz w:val="20"/>
+      </w:rPr>
+    </w:lvl>
+    <w:lvl w:ilvl="4" w:tentative="1">
+      <w:start w:val="1"/>
+      <w:numFmt w:val="bullet"/>
+      <w:lvlText w:val=""/>
+      <w:lvlJc w:val="left"/>
+      <w:pPr>
+        <w:tabs>
+          <w:tab w:val="num" w:pos="3600"/>
+        </w:tabs>
+        <w:ind w:left="3600" w:hanging="360"/>
+      </w:pPr>
+      <w:rPr>
+        <w:rFonts w:ascii="Wingdings" w:hAnsi="Wingdings" w:hint="default"/>
+        <w:sz w:val="20"/>
+      </w:rPr>
+    </w:lvl>
+    <w:lvl w:ilvl="5" w:tentative="1">
+      <w:start w:val="1"/>
+      <w:numFmt w:val="bullet"/>
+      <w:lvlText w:val=""/>
+      <w:lvlJc w:val="left"/>
+      <w:pPr>
+        <w:tabs>
+          <w:tab w:val="num" w:pos="4320"/>
+        </w:tabs>
+        <w:ind w:left="4320" w:hanging="360"/>
+      </w:pPr>
+      <w:rPr>
+        <w:rFonts w:ascii="Wingdings" w:hAnsi="Wingdings" w:hint="default"/>
+        <w:sz w:val="20"/>
+      </w:rPr>
+    </w:lvl>
+    <w:lvl w:ilvl="6" w:tentative="1">
+      <w:start w:val="1"/>
+      <w:numFmt w:val="bullet"/>
+      <w:lvlText w:val=""/>
+      <w:lvlJc w:val="left"/>
+      <w:pPr>
+        <w:tabs>
+          <w:tab w:val="num" w:pos="5040"/>
+        </w:tabs>
+        <w:ind w:left="5040" w:hanging="360"/>
+      </w:pPr>
+      <w:rPr>
+        <w:rFonts w:ascii="Wingdings" w:hAnsi="Wingdings" w:hint="default"/>
+        <w:sz w:val="20"/>
+      </w:rPr>
+    </w:lvl>
+    <w:lvl w:ilvl="7" w:tentative="1">
+      <w:start w:val="1"/>
+      <w:numFmt w:val="bullet"/>
+      <w:lvlText w:val=""/>
+      <w:lvlJc w:val="left"/>
+      <w:pPr>
+        <w:tabs>
+          <w:tab w:val="num" w:pos="5760"/>
+        </w:tabs>
+        <w:ind w:left="5760" w:hanging="360"/>
+      </w:pPr>
+      <w:rPr>
+        <w:rFonts w:ascii="Wingdings" w:hAnsi="Wingdings" w:hint="default"/>
+        <w:sz w:val="20"/>
+      </w:rPr>
+    </w:lvl>
+    <w:lvl w:ilvl="8" w:tentative="1">
+      <w:start w:val="1"/>
+      <w:numFmt w:val="bullet"/>
+      <w:lvlText w:val=""/>
+      <w:lvlJc w:val="left"/>
+      <w:pPr>
+        <w:tabs>
+          <w:tab w:val="num" w:pos="6480"/>
+        </w:tabs>
+        <w:ind w:left="6480" w:hanging="360"/>
+      </w:pPr>
+      <w:rPr>
+        <w:rFonts w:ascii="Wingdings" w:hAnsi="Wingdings" w:hint="default"/>
+        <w:sz w:val="20"/>
+      </w:rPr>
+    </w:lvl>
+  </w:abstractNum>
+  <w:abstractNum w:abstractNumId="6" w15:restartNumberingAfterBreak="0">
+    <w:nsid w:val="77F555E9"/>
+    <w:multiLevelType w:val="hybridMultilevel"/>
+    <w:tmpl w:val="E3501E98"/>
+    <w:lvl w:ilvl="0" w:tplc="C06A45BE">
+      <w:start w:val="1"/>
+      <w:numFmt w:val="decimal"/>
+      <w:lvlText w:val="%1."/>
+      <w:lvlJc w:val="left"/>
+      <w:pPr>
+        <w:ind w:left="730" w:hanging="390"/>
+      </w:pPr>
+      <w:rPr>
+        <w:rFonts w:ascii="Manrope" w:hAnsi="Manrope" w:hint="default"/>
+        <w:sz w:val="22"/>
+      </w:rPr>
+    </w:lvl>
+    <w:lvl w:ilvl="1" w:tplc="0C0A0019" w:tentative="1">
+      <w:start w:val="1"/>
+      <w:numFmt w:val="lowerLetter"/>
+      <w:lvlText w:val="%2."/>
+      <w:lvlJc w:val="left"/>
+      <w:pPr>
+        <w:ind w:left="1420" w:hanging="360"/>
+      </w:pPr>
+    </w:lvl>
+    <w:lvl w:ilvl="2" w:tplc="0C0A001B" w:tentative="1">
+      <w:start w:val="1"/>
+      <w:numFmt w:val="lowerRoman"/>
+      <w:lvlText w:val="%3."/>
+      <w:lvlJc w:val="right"/>
+      <w:pPr>
+        <w:ind w:left="2140" w:hanging="180"/>
+      </w:pPr>
+    </w:lvl>
+    <w:lvl w:ilvl="3" w:tplc="0C0A000F" w:tentative="1">
+      <w:start w:val="1"/>
+      <w:numFmt w:val="decimal"/>
+      <w:lvlText w:val="%4."/>
+      <w:lvlJc w:val="left"/>
+      <w:pPr>
+        <w:ind w:left="2860" w:hanging="360"/>
+      </w:pPr>
+    </w:lvl>
+    <w:lvl w:ilvl="4" w:tplc="0C0A0019" w:tentative="1">
+      <w:start w:val="1"/>
+      <w:numFmt w:val="lowerLetter"/>
+      <w:lvlText w:val="%5."/>
+      <w:lvlJc w:val="left"/>
+      <w:pPr>
+        <w:ind w:left="3580" w:hanging="360"/>
+      </w:pPr>
+    </w:lvl>
+    <w:lvl w:ilvl="5" w:tplc="0C0A001B" w:tentative="1">
+      <w:start w:val="1"/>
+      <w:numFmt w:val="lowerRoman"/>
+      <w:lvlText w:val="%6."/>
+      <w:lvlJc w:val="right"/>
+      <w:pPr>
+        <w:ind w:left="4300" w:hanging="180"/>
+      </w:pPr>
+    </w:lvl>
+    <w:lvl w:ilvl="6" w:tplc="0C0A000F" w:tentative="1">
+      <w:start w:val="1"/>
+      <w:numFmt w:val="decimal"/>
+      <w:lvlText w:val="%7."/>
+      <w:lvlJc w:val="left"/>
+      <w:pPr>
+        <w:ind w:left="5020" w:hanging="360"/>
+      </w:pPr>
+    </w:lvl>
+    <w:lvl w:ilvl="7" w:tplc="0C0A0019" w:tentative="1">
+      <w:start w:val="1"/>
+      <w:numFmt w:val="lowerLetter"/>
+      <w:lvlText w:val="%8."/>
+      <w:lvlJc w:val="left"/>
+      <w:pPr>
+        <w:ind w:left="5740" w:hanging="360"/>
+      </w:pPr>
+    </w:lvl>
+    <w:lvl w:ilvl="8" w:tplc="0C0A001B" w:tentative="1">
+      <w:start w:val="1"/>
+      <w:numFmt w:val="lowerRoman"/>
+      <w:lvlText w:val="%9."/>
+      <w:lvlJc w:val="right"/>
+      <w:pPr>
+        <w:ind w:left="6460" w:hanging="180"/>
+      </w:pPr>
+    </w:lvl>
+  </w:abstractNum>
+  <w:num w:numId="1" w16cid:durableId="1206022937">
+    <w:abstractNumId w:val="3"/>
+  </w:num>
+  <w:num w:numId="2" w16cid:durableId="2088069187">
+    <w:abstractNumId w:val="1"/>
+  </w:num>
+  <w:num w:numId="3" w16cid:durableId="323944628">
+    <w:abstractNumId w:val="2"/>
+  </w:num>
+  <w:num w:numId="4" w16cid:durableId="1419595460">
+    <w:abstractNumId w:val="0"/>
+  </w:num>
+  <w:num w:numId="5" w16cid:durableId="83961566">
+    <w:abstractNumId w:val="4"/>
+  </w:num>
+  <w:num w:numId="6" w16cid:durableId="2061439656">
+    <w:abstractNumId w:val="6"/>
+  </w:num>
+  <w:num w:numId="7" w16cid:durableId="1908999437">
+    <w:abstractNumId w:val="5"/>
+  </w:num>
+</w:numbering>
 </file>
 
 <file path=word/styles.xml><?xml version="1.0" encoding="utf-8"?>
@@ -3090,6 +4402,28 @@
     <w:uiPriority w:val="99"/>
     <w:rsid w:val="00155114"/>
   </w:style>
+  <w:style w:type="paragraph" w:styleId="Prrafodelista">
+    <w:name w:val="List Paragraph"/>
+    <w:basedOn w:val="Normal"/>
+    <w:uiPriority w:val="34"/>
+    <w:qFormat/>
+    <w:rsid w:val="00DF414C"/>
+    <w:pPr>
+      <w:ind w:left="720"/>
+      <w:contextualSpacing/>
+    </w:pPr>
+  </w:style>
+  <w:style w:type="paragraph" w:styleId="NormalWeb">
+    <w:name w:val="Normal (Web)"/>
+    <w:basedOn w:val="Normal"/>
+    <w:uiPriority w:val="99"/>
+    <w:semiHidden/>
+    <w:unhideWhenUsed/>
+    <w:rsid w:val="00795D1A"/>
+    <w:rPr>
+      <w:rFonts w:ascii="Times New Roman" w:hAnsi="Times New Roman" w:cs="Times New Roman"/>
+    </w:rPr>
+  </w:style>
 </w:styles>
 </file>
 

</xml_diff>